<commit_message>
Se actualiza manual práctica 4 y se elimina borrador de instrucciones
</commit_message>
<xml_diff>
--- a/Practicas/Practica 4/Practica 4_Contratos.docx
+++ b/Practicas/Practica 4/Practica 4_Contratos.docx
@@ -119,7 +119,7 @@
     <w:p>
       <w:r>
         <w:pict w14:anchorId="5FBAE4C0">
-          <v:rect id="_x0000_i2171" style="width:0;height:1.5pt" o:hralign="center" o:hrstd="t" o:hr="t"/>
+          <v:rect id="_x0000_i1026" style="width:0;height:1.5pt" o:hralign="center" o:hrstd="t" o:hr="t"/>
         </w:pict>
       </w:r>
     </w:p>
@@ -275,7 +275,7 @@
     <w:p>
       <w:r>
         <w:pict w14:anchorId="1FE67E62">
-          <v:rect id="_x0000_i2172" style="width:0;height:1.5pt" o:hralign="center" o:hrstd="t" o:hr="t"/>
+          <v:rect id="_x0000_i1027" style="width:0;height:1.5pt" o:hralign="center" o:hrstd="t" o:hr="t"/>
         </w:pict>
       </w:r>
     </w:p>
@@ -663,7 +663,7 @@
     <w:p>
       <w:r>
         <w:pict w14:anchorId="688B26E7">
-          <v:rect id="_x0000_i2173" style="width:0;height:1.5pt" o:hralign="center" o:hrstd="t" o:hr="t"/>
+          <v:rect id="_x0000_i1028" style="width:0;height:1.5pt" o:hralign="center" o:hrstd="t" o:hr="t"/>
         </w:pict>
       </w:r>
     </w:p>
@@ -852,9 +852,67 @@
       <w:r>
         <w:t>: GET, POST, PUT.</w:t>
       </w:r>
+    </w:p>
+    <w:p>
+      <w:pPr>
+        <w:pStyle w:val="Compact"/>
+        <w:numPr>
+          <w:ilvl w:val="0"/>
+          <w:numId w:val="4"/>
+        </w:numPr>
+      </w:pPr>
+      <w:proofErr w:type="spellStart"/>
+      <w:r>
+        <w:t>Probar</w:t>
+      </w:r>
+      <w:proofErr w:type="spellEnd"/>
+      <w:r>
+        <w:t xml:space="preserve"> </w:t>
+      </w:r>
+      <w:proofErr w:type="spellStart"/>
+      <w:r>
+        <w:rPr>
+          <w:b/>
+          <w:bCs/>
+        </w:rPr>
+        <w:t>Otras</w:t>
+      </w:r>
+      <w:proofErr w:type="spellEnd"/>
+      <w:r>
+        <w:rPr>
+          <w:b/>
+          <w:bCs/>
+        </w:rPr>
+        <w:t xml:space="preserve"> </w:t>
+      </w:r>
+      <w:proofErr w:type="spellStart"/>
+      <w:r>
+        <w:rPr>
+          <w:b/>
+          <w:bCs/>
+        </w:rPr>
+        <w:t>pruebas</w:t>
+      </w:r>
+      <w:proofErr w:type="spellEnd"/>
+      <w:r>
+        <w:rPr>
+          <w:b/>
+          <w:bCs/>
+        </w:rPr>
+        <w:t xml:space="preserve"> y </w:t>
+      </w:r>
+      <w:proofErr w:type="spellStart"/>
+      <w:r>
+        <w:rPr>
+          <w:b/>
+          <w:bCs/>
+        </w:rPr>
+        <w:t>documentos</w:t>
+      </w:r>
+      <w:proofErr w:type="spellEnd"/>
       <w:r>
         <w:pict w14:anchorId="3D6059B0">
-          <v:rect id="_x0000_i2174" style="width:0;height:1.5pt" o:hralign="center" o:hrstd="t" o:hr="t"/>
+          <v:rect id="_x0000_i1029" style="width:0;height:1.5pt" o:hralign="center" o:hrstd="t" o:hr="t"/>
         </w:pict>
       </w:r>
     </w:p>
@@ -1568,15 +1626,7 @@
       </w:r>
       <w:proofErr w:type="spellEnd"/>
       <w:r>
-        <w:t xml:space="preserve"> (parte superior), selecciona el esquema (por </w:t>
-      </w:r>
-      <w:proofErr w:type="gramStart"/>
-      <w:r>
-        <w:t>ejemplo</w:t>
-      </w:r>
-      <w:proofErr w:type="gramEnd"/>
-      <w:r>
-        <w:t xml:space="preserve"> </w:t>
+        <w:t xml:space="preserve"> (parte superior), selecciona el esquema (por ejemplo </w:t>
       </w:r>
       <w:proofErr w:type="spellStart"/>
       <w:r>
@@ -1730,7 +1780,7 @@
     <w:p>
       <w:r>
         <w:pict w14:anchorId="04D3931D">
-          <v:rect id="_x0000_i2175" style="width:0;height:1.5pt" o:hralign="center" o:bullet="t" o:hrstd="t" o:hr="t"/>
+          <v:rect id="_x0000_i1030" style="width:0;height:1.5pt" o:hralign="center" o:bullet="t" o:hrstd="t" o:hr="t"/>
         </w:pict>
       </w:r>
     </w:p>
@@ -1800,6 +1850,21 @@
       </w:pPr>
       <w:r>
         <w:rPr>
+          <w:rFonts w:ascii="Segoe UI Emoji" w:hAnsi="Segoe UI Emoji" w:cs="Segoe UI Emoji"/>
+          <w:b/>
+          <w:bCs/>
+        </w:rPr>
+        <w:t>🔹</w:t>
+      </w:r>
+      <w:r>
+        <w:rPr>
+          <w:b/>
+          <w:bCs/>
+        </w:rPr>
+        <w:t xml:space="preserve"> </w:t>
+      </w:r>
+      <w:r>
+        <w:rPr>
           <w:b/>
           <w:bCs/>
         </w:rPr>
@@ -1821,7 +1886,28 @@
       </w:r>
       <w:proofErr w:type="spellEnd"/>
       <w:r>
-        <w:t xml:space="preserve"> Point obtiene la lista de todos los contratos independientemente de que tipo sea</w:t>
+        <w:t xml:space="preserve"> Point obtiene la lista de todos los contratos </w:t>
+      </w:r>
+      <w:r>
+        <w:t xml:space="preserve">registrados de la empresa, </w:t>
+      </w:r>
+      <w:r>
+        <w:t>independientemente de</w:t>
+      </w:r>
+      <w:r>
+        <w:t>l</w:t>
+      </w:r>
+      <w:r>
+        <w:t xml:space="preserve"> tipo</w:t>
+      </w:r>
+      <w:r>
+        <w:t xml:space="preserve"> </w:t>
+      </w:r>
+      <w:r>
+        <w:t>de contrato</w:t>
+      </w:r>
+      <w:r>
+        <w:t>.</w:t>
       </w:r>
     </w:p>
     <w:p>
@@ -2501,7 +2587,6 @@
         </w:rPr>
         <w:t xml:space="preserve">      "perdidasGarantizadasCarga":</w:t>
       </w:r>
-      <w:proofErr w:type="gramStart"/>
       <w:r>
         <w:rPr>
           <w:color w:val="156082" w:themeColor="accent1"/>
@@ -2514,7 +2599,6 @@
         </w:rPr>
         <w:t xml:space="preserve"> ,</w:t>
       </w:r>
-      <w:proofErr w:type="gramEnd"/>
     </w:p>
     <w:p>
       <w:pPr>
@@ -3163,7 +3247,7 @@
       </w:pPr>
       <w:r>
         <w:pict w14:anchorId="53C2E887">
-          <v:rect id="_x0000_i2181" style="width:0;height:1.5pt" o:hralign="center" o:hrstd="t" o:hr="t" fillcolor="#a0a0a0" stroked="f"/>
+          <v:rect id="_x0000_i1031" style="width:0;height:1.5pt" o:hralign="center" o:hrstd="t" o:hr="t" fillcolor="#a0a0a0" stroked="f"/>
         </w:pict>
       </w:r>
     </w:p>
@@ -3935,7 +4019,7 @@
       </w:pPr>
       <w:r>
         <w:pict w14:anchorId="775F61F9">
-          <v:rect id="_x0000_i2182" style="width:0;height:1.5pt" o:hralign="center" o:hrstd="t" o:hr="t" fillcolor="#a0a0a0" stroked="f"/>
+          <v:rect id="_x0000_i1032" style="width:0;height:1.5pt" o:hralign="center" o:hrstd="t" o:hr="t" fillcolor="#a0a0a0" stroked="f"/>
         </w:pict>
       </w:r>
     </w:p>
@@ -4307,93 +4391,120 @@
         <w:pStyle w:val="Textoindependiente"/>
       </w:pPr>
       <w:r>
+        <w:br/>
+      </w:r>
+      <w:proofErr w:type="spellStart"/>
+      <w:r>
+        <w:t>Endpoint</w:t>
+      </w:r>
+      <w:proofErr w:type="spellEnd"/>
+      <w:r>
+        <w:t>: F1_ConfiguracionInicial/</w:t>
+      </w:r>
+      <w:proofErr w:type="spellStart"/>
+      <w:r>
+        <w:t>OtrasPruebasYDocumentos</w:t>
+      </w:r>
+      <w:proofErr w:type="spellEnd"/>
+    </w:p>
+    <w:p>
+      <w:pPr>
+        <w:pStyle w:val="Textoindependiente"/>
+      </w:pPr>
+      <w:r>
+        <w:t xml:space="preserve">Este </w:t>
+      </w:r>
+      <w:proofErr w:type="spellStart"/>
+      <w:r>
+        <w:t>endpoint</w:t>
+      </w:r>
+      <w:proofErr w:type="spellEnd"/>
+      <w:r>
+        <w:t xml:space="preserve"> permite registrar, actualizar y consultar la información de otras pruebas (pruebas de rutina) o documentos asociados a la configuración inicial de una empresa</w:t>
+      </w:r>
+      <w:r>
+        <w:t>.</w:t>
+      </w:r>
+    </w:p>
+    <w:p>
+      <w:pPr>
+        <w:pStyle w:val="Textoindependiente"/>
+      </w:pPr>
+    </w:p>
+    <w:p>
+      <w:pPr>
+        <w:pStyle w:val="Textoindependiente"/>
+        <w:rPr>
+          <w:b/>
+          <w:bCs/>
+        </w:rPr>
+      </w:pPr>
+      <w:r>
+        <w:rPr>
+          <w:rFonts w:ascii="Segoe UI Emoji" w:hAnsi="Segoe UI Emoji" w:cs="Segoe UI Emoji"/>
+          <w:b/>
+          <w:bCs/>
+        </w:rPr>
+        <w:t>🔹</w:t>
+      </w:r>
+      <w:r>
+        <w:rPr>
+          <w:b/>
+          <w:bCs/>
+        </w:rPr>
+        <w:t xml:space="preserve"> </w:t>
+      </w:r>
+      <w:r>
+        <w:rPr>
+          <w:b/>
+          <w:bCs/>
+        </w:rPr>
+        <w:t>GET</w:t>
+      </w:r>
+      <w:r>
+        <w:rPr>
+          <w:b/>
+          <w:bCs/>
+        </w:rPr>
+        <w:t xml:space="preserve"> - </w:t>
+      </w:r>
+      <w:r>
+        <w:rPr>
+          <w:b/>
+          <w:bCs/>
+        </w:rPr>
+        <w:t>Obtener todas las pruebas o documentos</w:t>
+      </w:r>
+    </w:p>
+    <w:p>
+      <w:pPr>
+        <w:pStyle w:val="Textoindependiente"/>
+      </w:pPr>
+      <w:proofErr w:type="spellStart"/>
+      <w:r>
+        <w:rPr>
+          <w:b/>
+          <w:bCs/>
+        </w:rPr>
+        <w:t>Endpoint</w:t>
+      </w:r>
+      <w:proofErr w:type="spellEnd"/>
+      <w:r>
+        <w:rPr>
+          <w:b/>
+          <w:bCs/>
+        </w:rPr>
+        <w:t>:</w:t>
+      </w:r>
+      <w:r>
+        <w:rPr>
+          <w:b/>
+          <w:bCs/>
+        </w:rPr>
+        <w:t xml:space="preserve">  </w:t>
+      </w:r>
+      <w:r>
         <w:t>F1_ConfiguracionInicial/</w:t>
-      </w:r>
-      <w:proofErr w:type="spellStart"/>
-      <w:r>
-        <w:t>OtrasPruebasYDocumentos</w:t>
-      </w:r>
-      <w:proofErr w:type="spellEnd"/>
-    </w:p>
-    <w:p>
-      <w:pPr>
-        <w:pStyle w:val="Textoindependiente"/>
-      </w:pPr>
-      <w:r>
-        <w:t xml:space="preserve">La API de </w:t>
-      </w:r>
-      <w:proofErr w:type="spellStart"/>
-      <w:r>
-        <w:rPr>
-          <w:b/>
-          <w:bCs/>
-        </w:rPr>
-        <w:t>OtrasPruebasYDocumentos</w:t>
-      </w:r>
-      <w:proofErr w:type="spellEnd"/>
-      <w:r>
-        <w:t xml:space="preserve"> permite registrar, actualizar y consultar pruebas de rutina u otros documentos relacionados con el proceso de configuración inicial.</w:t>
-      </w:r>
-      <w:r>
-        <w:br/>
-        <w:t xml:space="preserve">El uso de </w:t>
-      </w:r>
-      <w:proofErr w:type="spellStart"/>
-      <w:r>
-        <w:t>Swagger</w:t>
-      </w:r>
-      <w:proofErr w:type="spellEnd"/>
-      <w:r>
-        <w:t xml:space="preserve"> facilita las pruebas de los </w:t>
-      </w:r>
-      <w:proofErr w:type="spellStart"/>
-      <w:r>
-        <w:t>endpoints</w:t>
-      </w:r>
-      <w:proofErr w:type="spellEnd"/>
-      <w:r>
-        <w:t xml:space="preserve"> sin necesidad de escribir código adicional.</w:t>
-      </w:r>
-    </w:p>
-    <w:p>
-      <w:pPr>
-        <w:pStyle w:val="Textoindependiente"/>
-        <w:rPr>
-          <w:b/>
-          <w:bCs/>
-        </w:rPr>
-      </w:pPr>
-      <w:r>
-        <w:rPr>
-          <w:b/>
-          <w:bCs/>
-        </w:rPr>
-        <w:t>Obtener todas las pruebas o documentos (GET)</w:t>
-      </w:r>
-    </w:p>
-    <w:p>
-      <w:pPr>
-        <w:pStyle w:val="Textoindependiente"/>
-      </w:pPr>
-      <w:proofErr w:type="spellStart"/>
-      <w:r>
-        <w:rPr>
-          <w:b/>
-          <w:bCs/>
-        </w:rPr>
-        <w:t>Endpoint</w:t>
-      </w:r>
-      <w:proofErr w:type="spellEnd"/>
-      <w:r>
-        <w:rPr>
-          <w:b/>
-          <w:bCs/>
-        </w:rPr>
-        <w:t>:</w:t>
-      </w:r>
-      <w:r>
-        <w:br/>
-        <w:t>/F1_ConfiguracionInicial/</w:t>
       </w:r>
       <w:proofErr w:type="spellStart"/>
       <w:r>
@@ -4414,10 +4525,13 @@
           <w:b/>
           <w:bCs/>
         </w:rPr>
-        <w:t>Método:</w:t>
-      </w:r>
-      <w:r>
-        <w:t xml:space="preserve"> GET</w:t>
+        <w:t>Descripción:</w:t>
+      </w:r>
+      <w:r>
+        <w:t xml:space="preserve"> </w:t>
+      </w:r>
+      <w:r>
+        <w:t>Obtiene todas las pruebas o documentos registrados para la empresa.</w:t>
       </w:r>
     </w:p>
     <w:p>
@@ -4433,10 +4547,10 @@
           <w:b/>
           <w:bCs/>
         </w:rPr>
-        <w:t>Descripción:</w:t>
-      </w:r>
-      <w:r>
-        <w:t xml:space="preserve"> Obtiene todas las pruebas o documentos registrados para la empresa.</w:t>
+        <w:t>Parámetros:</w:t>
+      </w:r>
+      <w:r>
+        <w:t xml:space="preserve"> No requiere parámetros de entrada.</w:t>
       </w:r>
     </w:p>
     <w:p>
@@ -4452,10 +4566,208 @@
           <w:b/>
           <w:bCs/>
         </w:rPr>
-        <w:t>Parámetros:</w:t>
-      </w:r>
-      <w:r>
-        <w:t xml:space="preserve"> No requiere parámetros de entrada.</w:t>
+        <w:t>Respuesta esperada (200 OK):</w:t>
+      </w:r>
+    </w:p>
+    <w:p>
+      <w:pPr>
+        <w:pStyle w:val="Textoindependiente"/>
+        <w:ind w:left="1416"/>
+        <w:rPr>
+          <w:color w:val="156082" w:themeColor="accent1"/>
+        </w:rPr>
+      </w:pPr>
+      <w:r>
+        <w:rPr>
+          <w:color w:val="156082" w:themeColor="accent1"/>
+        </w:rPr>
+        <w:t>[ {</w:t>
+      </w:r>
+    </w:p>
+    <w:p>
+      <w:pPr>
+        <w:pStyle w:val="Textoindependiente"/>
+        <w:ind w:left="1416"/>
+        <w:rPr>
+          <w:color w:val="156082" w:themeColor="accent1"/>
+        </w:rPr>
+      </w:pPr>
+      <w:r>
+        <w:rPr>
+          <w:color w:val="156082" w:themeColor="accent1"/>
+        </w:rPr>
+        <w:t xml:space="preserve">    "id": "68b9b3a6ce4fbe620abc2b3e",</w:t>
+      </w:r>
+    </w:p>
+    <w:p>
+      <w:pPr>
+        <w:pStyle w:val="Textoindependiente"/>
+        <w:ind w:left="1416"/>
+        <w:rPr>
+          <w:color w:val="156082" w:themeColor="accent1"/>
+        </w:rPr>
+      </w:pPr>
+      <w:r>
+        <w:rPr>
+          <w:color w:val="156082" w:themeColor="accent1"/>
+        </w:rPr>
+        <w:t xml:space="preserve">    "</w:t>
+      </w:r>
+      <w:proofErr w:type="spellStart"/>
+      <w:r>
+        <w:rPr>
+          <w:color w:val="156082" w:themeColor="accent1"/>
+        </w:rPr>
+        <w:t>tipoDocumento</w:t>
+      </w:r>
+      <w:proofErr w:type="spellEnd"/>
+      <w:r>
+        <w:rPr>
+          <w:color w:val="156082" w:themeColor="accent1"/>
+        </w:rPr>
+        <w:t>": "Prueba Rutina",</w:t>
+      </w:r>
+    </w:p>
+    <w:p>
+      <w:pPr>
+        <w:pStyle w:val="Textoindependiente"/>
+        <w:ind w:left="1416"/>
+        <w:rPr>
+          <w:color w:val="156082" w:themeColor="accent1"/>
+        </w:rPr>
+      </w:pPr>
+      <w:r>
+        <w:rPr>
+          <w:color w:val="156082" w:themeColor="accent1"/>
+        </w:rPr>
+        <w:t xml:space="preserve">    "</w:t>
+      </w:r>
+      <w:proofErr w:type="spellStart"/>
+      <w:r>
+        <w:rPr>
+          <w:color w:val="156082" w:themeColor="accent1"/>
+        </w:rPr>
+        <w:t>descripcion</w:t>
+      </w:r>
+      <w:proofErr w:type="spellEnd"/>
+      <w:r>
+        <w:rPr>
+          <w:color w:val="156082" w:themeColor="accent1"/>
+        </w:rPr>
+        <w:t>": "Prueba de resistencia de aislamiento",</w:t>
+      </w:r>
+    </w:p>
+    <w:p>
+      <w:pPr>
+        <w:pStyle w:val="Textoindependiente"/>
+        <w:ind w:left="1416"/>
+        <w:rPr>
+          <w:color w:val="156082" w:themeColor="accent1"/>
+        </w:rPr>
+      </w:pPr>
+      <w:r>
+        <w:rPr>
+          <w:color w:val="156082" w:themeColor="accent1"/>
+        </w:rPr>
+        <w:t xml:space="preserve">    "</w:t>
+      </w:r>
+      <w:proofErr w:type="spellStart"/>
+      <w:r>
+        <w:rPr>
+          <w:color w:val="156082" w:themeColor="accent1"/>
+        </w:rPr>
+        <w:t>fechaRegistro</w:t>
+      </w:r>
+      <w:proofErr w:type="spellEnd"/>
+      <w:r>
+        <w:rPr>
+          <w:color w:val="156082" w:themeColor="accent1"/>
+        </w:rPr>
+        <w:t>": "2025-03-01T00:00:00Z",</w:t>
+      </w:r>
+    </w:p>
+    <w:p>
+      <w:pPr>
+        <w:pStyle w:val="Textoindependiente"/>
+        <w:ind w:left="1416"/>
+        <w:rPr>
+          <w:color w:val="156082" w:themeColor="accent1"/>
+        </w:rPr>
+      </w:pPr>
+      <w:r>
+        <w:rPr>
+          <w:color w:val="156082" w:themeColor="accent1"/>
+        </w:rPr>
+        <w:t xml:space="preserve">    "estatus": "Activo"</w:t>
+      </w:r>
+    </w:p>
+    <w:p>
+      <w:pPr>
+        <w:pStyle w:val="Textoindependiente"/>
+        <w:ind w:left="1416"/>
+        <w:rPr>
+          <w:color w:val="156082" w:themeColor="accent1"/>
+        </w:rPr>
+      </w:pPr>
+      <w:r>
+        <w:rPr>
+          <w:color w:val="156082" w:themeColor="accent1"/>
+        </w:rPr>
+        <w:t xml:space="preserve">  }]</w:t>
+      </w:r>
+    </w:p>
+    <w:p>
+      <w:pPr>
+        <w:pStyle w:val="Textoindependiente"/>
+        <w:ind w:left="1416"/>
+        <w:rPr>
+          <w:color w:val="156082" w:themeColor="accent1"/>
+        </w:rPr>
+      </w:pPr>
+    </w:p>
+    <w:p>
+      <w:pPr>
+        <w:pStyle w:val="Textoindependiente"/>
+        <w:rPr>
+          <w:b/>
+          <w:bCs/>
+        </w:rPr>
+      </w:pPr>
+      <w:r>
+        <w:rPr>
+          <w:rFonts w:ascii="Segoe UI Emoji" w:hAnsi="Segoe UI Emoji" w:cs="Segoe UI Emoji"/>
+          <w:b/>
+          <w:bCs/>
+        </w:rPr>
+        <w:t>🔹</w:t>
+      </w:r>
+      <w:r>
+        <w:rPr>
+          <w:b/>
+          <w:bCs/>
+        </w:rPr>
+        <w:t xml:space="preserve"> </w:t>
+      </w:r>
+      <w:r>
+        <w:rPr>
+          <w:b/>
+          <w:bCs/>
+        </w:rPr>
+        <w:t>POST</w:t>
+      </w:r>
+      <w:r>
+        <w:rPr>
+          <w:b/>
+          <w:bCs/>
+        </w:rPr>
+        <w:t xml:space="preserve"> - </w:t>
+      </w:r>
+      <w:r>
+        <w:rPr>
+          <w:b/>
+          <w:bCs/>
+        </w:rPr>
+        <w:t>Registrar una nueva prueba o documento</w:t>
       </w:r>
     </w:p>
     <w:p>
@@ -4463,7 +4775,7 @@
         <w:pStyle w:val="Textoindependiente"/>
         <w:numPr>
           <w:ilvl w:val="0"/>
-          <w:numId w:val="29"/>
+          <w:numId w:val="35"/>
         </w:numPr>
       </w:pPr>
       <w:r>
@@ -4471,185 +4783,454 @@
           <w:b/>
           <w:bCs/>
         </w:rPr>
-        <w:t>Respuesta esperada (200 OK):</w:t>
-      </w:r>
-    </w:p>
-    <w:p>
-      <w:pPr>
-        <w:pStyle w:val="Textoindependiente"/>
-        <w:ind w:left="1416"/>
-        <w:rPr>
-          <w:color w:val="156082" w:themeColor="accent1"/>
-        </w:rPr>
-      </w:pPr>
-      <w:r>
-        <w:rPr>
-          <w:color w:val="156082" w:themeColor="accent1"/>
-        </w:rPr>
-        <w:t>[</w:t>
-      </w:r>
-    </w:p>
-    <w:p>
-      <w:pPr>
-        <w:pStyle w:val="Textoindependiente"/>
-        <w:ind w:left="1416"/>
-        <w:rPr>
-          <w:color w:val="156082" w:themeColor="accent1"/>
-        </w:rPr>
-      </w:pPr>
-      <w:r>
-        <w:rPr>
-          <w:color w:val="156082" w:themeColor="accent1"/>
-        </w:rPr>
-        <w:t xml:space="preserve">  {</w:t>
-      </w:r>
-    </w:p>
-    <w:p>
-      <w:pPr>
-        <w:pStyle w:val="Textoindependiente"/>
-        <w:ind w:left="1416"/>
-        <w:rPr>
-          <w:color w:val="156082" w:themeColor="accent1"/>
-        </w:rPr>
-      </w:pPr>
-      <w:r>
-        <w:rPr>
-          <w:color w:val="156082" w:themeColor="accent1"/>
-        </w:rPr>
-        <w:t xml:space="preserve">    "id": "68b9b3a6ce4fbe620abc2b3e",</w:t>
-      </w:r>
-    </w:p>
-    <w:p>
-      <w:pPr>
-        <w:pStyle w:val="Textoindependiente"/>
-        <w:ind w:left="1416"/>
-        <w:rPr>
-          <w:color w:val="156082" w:themeColor="accent1"/>
-        </w:rPr>
-      </w:pPr>
-      <w:r>
-        <w:rPr>
-          <w:color w:val="156082" w:themeColor="accent1"/>
-        </w:rPr>
-        <w:t xml:space="preserve">    "</w:t>
-      </w:r>
-      <w:proofErr w:type="spellStart"/>
-      <w:r>
-        <w:rPr>
-          <w:color w:val="156082" w:themeColor="accent1"/>
-        </w:rPr>
+        <w:t>Descripción:</w:t>
+      </w:r>
+      <w:r>
+        <w:t xml:space="preserve"> Permite agregar un nuevo registro de prueba de rutina o documento en el sistema.</w:t>
+      </w:r>
+    </w:p>
+    <w:p>
+      <w:pPr>
+        <w:pStyle w:val="Textoindependiente"/>
+        <w:rPr>
+          <w:b/>
+          <w:bCs/>
+        </w:rPr>
+      </w:pPr>
+      <w:proofErr w:type="spellStart"/>
+      <w:r>
+        <w:rPr>
+          <w:b/>
+          <w:bCs/>
+        </w:rPr>
+        <w:t>Request</w:t>
+      </w:r>
+      <w:proofErr w:type="spellEnd"/>
+      <w:r>
+        <w:rPr>
+          <w:b/>
+          <w:bCs/>
+        </w:rPr>
+        <w:t xml:space="preserve"> </w:t>
+      </w:r>
+      <w:proofErr w:type="spellStart"/>
+      <w:r>
+        <w:rPr>
+          <w:b/>
+          <w:bCs/>
+        </w:rPr>
+        <w:t>Body</w:t>
+      </w:r>
+      <w:proofErr w:type="spellEnd"/>
+      <w:r>
+        <w:rPr>
+          <w:b/>
+          <w:bCs/>
+        </w:rPr>
+        <w:t xml:space="preserve"> (ejemplo)</w:t>
+      </w:r>
+    </w:p>
+    <w:p>
+      <w:pPr>
+        <w:pStyle w:val="Textoindependiente"/>
+      </w:pPr>
+      <w:r>
+        <w:t>{</w:t>
+      </w:r>
+    </w:p>
+    <w:p>
+      <w:pPr>
+        <w:pStyle w:val="Textoindependiente"/>
+      </w:pPr>
+      <w:r>
+        <w:t xml:space="preserve">  "</w:t>
+      </w:r>
+      <w:proofErr w:type="spellStart"/>
+      <w:r>
         <w:t>tipoDocumento</w:t>
       </w:r>
       <w:proofErr w:type="spellEnd"/>
       <w:r>
-        <w:rPr>
-          <w:color w:val="156082" w:themeColor="accent1"/>
-        </w:rPr>
-        <w:t>": "Prueba Rutina",</w:t>
-      </w:r>
-    </w:p>
-    <w:p>
-      <w:pPr>
-        <w:pStyle w:val="Textoindependiente"/>
-        <w:ind w:left="1416"/>
-        <w:rPr>
-          <w:color w:val="156082" w:themeColor="accent1"/>
-        </w:rPr>
-      </w:pPr>
-      <w:r>
-        <w:rPr>
-          <w:color w:val="156082" w:themeColor="accent1"/>
-        </w:rPr>
-        <w:t xml:space="preserve">    "</w:t>
-      </w:r>
-      <w:proofErr w:type="spellStart"/>
-      <w:r>
-        <w:rPr>
-          <w:color w:val="156082" w:themeColor="accent1"/>
-        </w:rPr>
-        <w:t>descripcion</w:t>
-      </w:r>
-      <w:proofErr w:type="spellEnd"/>
-      <w:r>
-        <w:rPr>
-          <w:color w:val="156082" w:themeColor="accent1"/>
-        </w:rPr>
-        <w:t>": "Prueba de resistencia de aislamiento",</w:t>
-      </w:r>
-    </w:p>
-    <w:p>
-      <w:pPr>
-        <w:pStyle w:val="Textoindependiente"/>
-        <w:ind w:left="1416"/>
-        <w:rPr>
-          <w:color w:val="156082" w:themeColor="accent1"/>
-        </w:rPr>
-      </w:pPr>
-      <w:r>
-        <w:rPr>
-          <w:color w:val="156082" w:themeColor="accent1"/>
-        </w:rPr>
-        <w:t xml:space="preserve">    "</w:t>
-      </w:r>
-      <w:proofErr w:type="spellStart"/>
-      <w:r>
-        <w:rPr>
-          <w:color w:val="156082" w:themeColor="accent1"/>
-        </w:rPr>
-        <w:t>fechaRegistro</w:t>
-      </w:r>
-      <w:proofErr w:type="spellEnd"/>
-      <w:r>
-        <w:rPr>
-          <w:color w:val="156082" w:themeColor="accent1"/>
-        </w:rPr>
-        <w:t>": "2025-03-01T00:00:00Z",</w:t>
-      </w:r>
-    </w:p>
-    <w:p>
-      <w:pPr>
-        <w:pStyle w:val="Textoindependiente"/>
-        <w:ind w:left="1416"/>
-        <w:rPr>
-          <w:color w:val="156082" w:themeColor="accent1"/>
-        </w:rPr>
-      </w:pPr>
-      <w:r>
-        <w:rPr>
-          <w:color w:val="156082" w:themeColor="accent1"/>
-        </w:rPr>
+        <w:t>": "</w:t>
+      </w:r>
+      <w:proofErr w:type="spellStart"/>
+      <w:r>
+        <w:t>PruebasRutina</w:t>
+      </w:r>
+      <w:proofErr w:type="spellEnd"/>
+      <w:r>
+        <w:t>",</w:t>
+      </w:r>
+    </w:p>
+    <w:p>
+      <w:pPr>
+        <w:pStyle w:val="Textoindependiente"/>
+      </w:pPr>
+      <w:r>
+        <w:t xml:space="preserve">  "</w:t>
+      </w:r>
+      <w:proofErr w:type="spellStart"/>
+      <w:r>
+        <w:t>descripcionDocumento</w:t>
+      </w:r>
+      <w:proofErr w:type="spellEnd"/>
+      <w:r>
+        <w:t>": "Prueba de rutina al equipo",</w:t>
+      </w:r>
+    </w:p>
+    <w:p>
+      <w:pPr>
+        <w:pStyle w:val="Textoindependiente"/>
+      </w:pPr>
+      <w:r>
+        <w:t xml:space="preserve">  "</w:t>
+      </w:r>
+      <w:proofErr w:type="spellStart"/>
+      <w:r>
+        <w:t>urlArchivo</w:t>
+      </w:r>
+      <w:proofErr w:type="spellEnd"/>
+      <w:r>
+        <w:t>": "https://www.cfe.mx",</w:t>
+      </w:r>
+    </w:p>
+    <w:p>
+      <w:pPr>
+        <w:pStyle w:val="Textoindependiente"/>
+      </w:pPr>
+      <w:r>
+        <w:t xml:space="preserve">  "mD5": "aec9e70f22caf811a92cac041d94223f",</w:t>
+      </w:r>
+    </w:p>
+    <w:p>
+      <w:pPr>
+        <w:pStyle w:val="Textoindependiente"/>
+      </w:pPr>
+      <w:r>
+        <w:t xml:space="preserve">  "estatus": "ACTIVO",</w:t>
+      </w:r>
+    </w:p>
+    <w:p>
+      <w:pPr>
+        <w:pStyle w:val="Textoindependiente"/>
+      </w:pPr>
+      <w:r>
+        <w:t xml:space="preserve">  "vigencia": "2026-02-09T06:00:00Z"</w:t>
+      </w:r>
+    </w:p>
+    <w:p>
+      <w:pPr>
+        <w:pStyle w:val="Textoindependiente"/>
+      </w:pPr>
+      <w:r>
+        <w:t>}</w:t>
+      </w:r>
+    </w:p>
+    <w:p>
+      <w:pPr>
+        <w:pStyle w:val="Textoindependiente"/>
+        <w:rPr>
+          <w:b/>
+          <w:bCs/>
+        </w:rPr>
+      </w:pPr>
+      <w:r>
+        <w:rPr>
+          <w:b/>
+          <w:bCs/>
+        </w:rPr>
+        <w:t>Response (200 OK)</w:t>
+      </w:r>
+    </w:p>
+    <w:p>
+      <w:pPr>
+        <w:pStyle w:val="Textoindependiente"/>
+      </w:pPr>
+      <w:r>
+        <w:t>{</w:t>
+      </w:r>
+    </w:p>
+    <w:p>
+      <w:pPr>
+        <w:pStyle w:val="Textoindependiente"/>
+      </w:pPr>
+      <w:r>
+        <w:t xml:space="preserve">  "mensaje": "La prueba o documento fue registrado correctamente"</w:t>
+      </w:r>
+    </w:p>
+    <w:p>
+      <w:pPr>
+        <w:pStyle w:val="Textoindependiente"/>
+      </w:pPr>
+      <w:r>
+        <w:t>}</w:t>
+      </w:r>
+    </w:p>
+    <w:p>
+      <w:pPr>
+        <w:pStyle w:val="Textoindependiente"/>
+      </w:pPr>
+      <w:r>
+        <w:pict w14:anchorId="3CE677D3">
+          <v:rect id="_x0000_i1069" style="width:0;height:1.5pt" o:hralign="center" o:hrstd="t" o:hr="t" fillcolor="#a0a0a0" stroked="f"/>
+        </w:pict>
+      </w:r>
+    </w:p>
+    <w:p>
+      <w:pPr>
+        <w:pStyle w:val="Textoindependiente"/>
+        <w:rPr>
+          <w:b/>
+          <w:bCs/>
+        </w:rPr>
+      </w:pPr>
+      <w:r>
+        <w:rPr>
+          <w:rFonts w:ascii="Segoe UI Emoji" w:hAnsi="Segoe UI Emoji" w:cs="Segoe UI Emoji"/>
+          <w:b/>
+          <w:bCs/>
+        </w:rPr>
+        <w:t>🔹</w:t>
+      </w:r>
+      <w:r>
+        <w:rPr>
+          <w:b/>
+          <w:bCs/>
+        </w:rPr>
+        <w:t xml:space="preserve"> </w:t>
+      </w:r>
+      <w:r>
+        <w:rPr>
+          <w:b/>
+          <w:bCs/>
+        </w:rPr>
+        <w:t>P</w:t>
+      </w:r>
+      <w:r>
+        <w:rPr>
+          <w:b/>
+          <w:bCs/>
+        </w:rPr>
+        <w:t>U</w:t>
+      </w:r>
+      <w:r>
+        <w:rPr>
+          <w:b/>
+          <w:bCs/>
+        </w:rPr>
+        <w:t xml:space="preserve">T - </w:t>
+      </w:r>
+      <w:r>
+        <w:rPr>
+          <w:b/>
+          <w:bCs/>
+        </w:rPr>
+        <w:t>Actualizar una prueba o documento existente</w:t>
+      </w:r>
+    </w:p>
+    <w:p>
+      <w:pPr>
+        <w:pStyle w:val="Textoindependiente"/>
+        <w:numPr>
+          <w:ilvl w:val="0"/>
+          <w:numId w:val="36"/>
+        </w:numPr>
+      </w:pPr>
+      <w:r>
+        <w:rPr>
+          <w:b/>
+          <w:bCs/>
+        </w:rPr>
+        <w:t>Descripción:</w:t>
+      </w:r>
+      <w:r>
+        <w:t xml:space="preserve"> Permite modificar la información de una prueba de rutina o documento previamente registrado.</w:t>
+      </w:r>
+    </w:p>
+    <w:p>
+      <w:pPr>
+        <w:pStyle w:val="Textoindependiente"/>
+        <w:rPr>
+          <w:b/>
+          <w:bCs/>
+        </w:rPr>
+      </w:pPr>
+      <w:proofErr w:type="spellStart"/>
+      <w:r>
+        <w:rPr>
+          <w:b/>
+          <w:bCs/>
+        </w:rPr>
+        <w:t>Request</w:t>
+      </w:r>
+      <w:proofErr w:type="spellEnd"/>
+      <w:r>
+        <w:rPr>
+          <w:b/>
+          <w:bCs/>
+        </w:rPr>
+        <w:t xml:space="preserve"> </w:t>
+      </w:r>
+      <w:proofErr w:type="spellStart"/>
+      <w:r>
+        <w:rPr>
+          <w:b/>
+          <w:bCs/>
+        </w:rPr>
+        <w:t>Body</w:t>
+      </w:r>
+      <w:proofErr w:type="spellEnd"/>
+      <w:r>
+        <w:rPr>
+          <w:b/>
+          <w:bCs/>
+        </w:rPr>
+        <w:t xml:space="preserve"> (ejemplo)</w:t>
+      </w:r>
+    </w:p>
+    <w:p>
+      <w:pPr>
+        <w:pStyle w:val="Textoindependiente"/>
+      </w:pPr>
+      <w:r>
+        <w:t>{</w:t>
+      </w:r>
+    </w:p>
+    <w:p>
+      <w:pPr>
+        <w:pStyle w:val="Textoindependiente"/>
+      </w:pPr>
+      <w:r>
+        <w:t xml:space="preserve">  "id": "68b0eab5c86b8df36bdb5583",</w:t>
+      </w:r>
+    </w:p>
+    <w:p>
+      <w:pPr>
+        <w:pStyle w:val="Textoindependiente"/>
+      </w:pPr>
+      <w:r>
+        <w:t xml:space="preserve">  "</w:t>
+      </w:r>
+      <w:proofErr w:type="spellStart"/>
+      <w:r>
+        <w:t>tipoDocumento</w:t>
+      </w:r>
+      <w:proofErr w:type="spellEnd"/>
+      <w:r>
+        <w:t>": "</w:t>
+      </w:r>
+      <w:proofErr w:type="spellStart"/>
+      <w:r>
+        <w:t>PruebasRutina</w:t>
+      </w:r>
+      <w:proofErr w:type="spellEnd"/>
+      <w:r>
+        <w:t>",</w:t>
+      </w:r>
+    </w:p>
+    <w:p>
+      <w:pPr>
+        <w:pStyle w:val="Textoindependiente"/>
+      </w:pPr>
+      <w:r>
+        <w:t xml:space="preserve">  "</w:t>
+      </w:r>
+      <w:proofErr w:type="spellStart"/>
+      <w:r>
+        <w:t>descripcionDocumento</w:t>
+      </w:r>
+      <w:proofErr w:type="spellEnd"/>
+      <w:r>
+        <w:t>": "Prueba de rutina al equipo actualizado",</w:t>
+      </w:r>
+    </w:p>
+    <w:p>
+      <w:pPr>
+        <w:pStyle w:val="Textoindependiente"/>
+      </w:pPr>
+      <w:r>
+        <w:t xml:space="preserve">  "</w:t>
+      </w:r>
+      <w:proofErr w:type="spellStart"/>
+      <w:r>
+        <w:t>urlArchivo</w:t>
+      </w:r>
+      <w:proofErr w:type="spellEnd"/>
+      <w:r>
+        <w:t>": "https://www.cfe.mx/nueva-version",</w:t>
+      </w:r>
+    </w:p>
+    <w:p>
+      <w:pPr>
+        <w:pStyle w:val="Textoindependiente"/>
+      </w:pPr>
+      <w:r>
+        <w:t xml:space="preserve">  "mD5": "bbf1234567890caf811a92cac041d942",</w:t>
+      </w:r>
+    </w:p>
+    <w:p>
+      <w:pPr>
+        <w:pStyle w:val="Textoindependiente"/>
+      </w:pPr>
+      <w:r>
+        <w:t xml:space="preserve">  "estatus": "ACTIVO",</w:t>
+      </w:r>
+    </w:p>
+    <w:p>
+      <w:pPr>
+        <w:pStyle w:val="Textoindependiente"/>
+      </w:pPr>
+      <w:r>
+        <w:t xml:space="preserve">  "vigencia": "2027-01-01T06:00:00Z"</w:t>
+      </w:r>
+    </w:p>
+    <w:p>
+      <w:pPr>
+        <w:pStyle w:val="Textoindependiente"/>
+      </w:pPr>
+      <w:r>
         <w:lastRenderedPageBreak/>
-        <w:t xml:space="preserve">    "estatus": "Activo"</w:t>
-      </w:r>
-    </w:p>
-    <w:p>
-      <w:pPr>
-        <w:pStyle w:val="Textoindependiente"/>
-        <w:ind w:left="1416"/>
-        <w:rPr>
-          <w:color w:val="156082" w:themeColor="accent1"/>
-        </w:rPr>
-      </w:pPr>
-      <w:r>
-        <w:rPr>
-          <w:color w:val="156082" w:themeColor="accent1"/>
-        </w:rPr>
-        <w:t xml:space="preserve">  }</w:t>
-      </w:r>
-    </w:p>
-    <w:p>
-      <w:pPr>
-        <w:pStyle w:val="Textoindependiente"/>
-        <w:ind w:left="1416"/>
-        <w:rPr>
-          <w:color w:val="156082" w:themeColor="accent1"/>
-        </w:rPr>
-      </w:pPr>
-      <w:r>
-        <w:rPr>
-          <w:color w:val="156082" w:themeColor="accent1"/>
-        </w:rPr>
-        <w:t>]</w:t>
+        <w:t>}</w:t>
+      </w:r>
+    </w:p>
+    <w:p>
+      <w:pPr>
+        <w:pStyle w:val="Textoindependiente"/>
+        <w:rPr>
+          <w:b/>
+          <w:bCs/>
+        </w:rPr>
+      </w:pPr>
+      <w:r>
+        <w:rPr>
+          <w:b/>
+          <w:bCs/>
+        </w:rPr>
+        <w:t>Response (200 OK)</w:t>
+      </w:r>
+    </w:p>
+    <w:p>
+      <w:pPr>
+        <w:pStyle w:val="Textoindependiente"/>
+      </w:pPr>
+      <w:r>
+        <w:t>{</w:t>
+      </w:r>
+    </w:p>
+    <w:p>
+      <w:pPr>
+        <w:pStyle w:val="Textoindependiente"/>
+      </w:pPr>
+      <w:r>
+        <w:t xml:space="preserve">  "mensaje": "La prueba o documento fue actualizado correctamente"</w:t>
+      </w:r>
+    </w:p>
+    <w:p>
+      <w:pPr>
+        <w:pStyle w:val="Textoindependiente"/>
+      </w:pPr>
+      <w:r>
+        <w:t>}</w:t>
       </w:r>
     </w:p>
     <w:p>
@@ -4658,7 +5239,7 @@
       </w:pPr>
       <w:r>
         <w:pict w14:anchorId="0E263CC3">
-          <v:rect id="_x0000_i2680" style="width:0;height:1.5pt" o:hralign="center" o:hrstd="t" o:hr="t" fillcolor="#a0a0a0" stroked="f"/>
+          <v:rect id="_x0000_i1033" style="width:0;height:1.5pt" o:hralign="center" o:hrstd="t" o:hr="t" fillcolor="#a0a0a0" stroked="f"/>
         </w:pict>
       </w:r>
     </w:p>
@@ -4770,23 +5351,53 @@
         </w:numPr>
       </w:pPr>
       <w:r>
-        <w:t xml:space="preserve">Usa los parámetros </w:t>
-      </w:r>
-      <w:proofErr w:type="spellStart"/>
-      <w:r>
-        <w:t>pageNumber</w:t>
-      </w:r>
-      <w:proofErr w:type="spellEnd"/>
-      <w:r>
-        <w:t xml:space="preserve"> y </w:t>
-      </w:r>
-      <w:proofErr w:type="spellStart"/>
-      <w:r>
-        <w:t>pageSize</w:t>
-      </w:r>
-      <w:proofErr w:type="spellEnd"/>
-      <w:r>
-        <w:t>.</w:t>
+        <w:t xml:space="preserve">Pulsa </w:t>
+      </w:r>
+      <w:r>
+        <w:rPr>
+          <w:b/>
+          <w:bCs/>
+        </w:rPr>
+        <w:t xml:space="preserve">Try </w:t>
+      </w:r>
+      <w:proofErr w:type="spellStart"/>
+      <w:r>
+        <w:rPr>
+          <w:b/>
+          <w:bCs/>
+        </w:rPr>
+        <w:t>it</w:t>
+      </w:r>
+      <w:proofErr w:type="spellEnd"/>
+      <w:r>
+        <w:rPr>
+          <w:b/>
+          <w:bCs/>
+        </w:rPr>
+        <w:t xml:space="preserve"> </w:t>
+      </w:r>
+      <w:proofErr w:type="spellStart"/>
+      <w:r>
+        <w:rPr>
+          <w:b/>
+          <w:bCs/>
+        </w:rPr>
+        <w:t>out</w:t>
+      </w:r>
+      <w:proofErr w:type="spellEnd"/>
+      <w:r>
+        <w:rPr>
+          <w:b/>
+          <w:bCs/>
+        </w:rPr>
+        <w:tab/>
+      </w:r>
+      <w:r>
+        <w:rPr>
+          <w:b/>
+          <w:bCs/>
+        </w:rPr>
+        <w:tab/>
       </w:r>
     </w:p>
     <w:p>
@@ -4797,6 +5408,43 @@
         </w:numPr>
       </w:pPr>
       <w:r>
+        <w:t>En los parámetros de consulta, coloca:</w:t>
+      </w:r>
+    </w:p>
+    <w:p>
+      <w:pPr>
+        <w:ind w:firstLine="708"/>
+      </w:pPr>
+      <w:proofErr w:type="spellStart"/>
+      <w:r>
+        <w:t>pageNumber</w:t>
+      </w:r>
+      <w:proofErr w:type="spellEnd"/>
+      <w:r>
+        <w:t xml:space="preserve"> = 1</w:t>
+      </w:r>
+    </w:p>
+    <w:p>
+      <w:r>
+        <w:t xml:space="preserve">               </w:t>
+      </w:r>
+      <w:proofErr w:type="spellStart"/>
+      <w:r>
+        <w:t>pageSize</w:t>
+      </w:r>
+      <w:proofErr w:type="spellEnd"/>
+      <w:r>
+        <w:t xml:space="preserve"> = 10</w:t>
+      </w:r>
+    </w:p>
+    <w:p>
+      <w:pPr>
+        <w:numPr>
+          <w:ilvl w:val="0"/>
+          <w:numId w:val="17"/>
+        </w:numPr>
+      </w:pPr>
+      <w:r>
         <w:t>Observa los distintos tipos de contratos en la respuesta JSON (</w:t>
       </w:r>
       <w:proofErr w:type="spellStart"/>
@@ -4827,7 +5475,7 @@
     <w:p>
       <w:r>
         <w:pict w14:anchorId="08AF70AB">
-          <v:rect id="_x0000_i2183" style="width:0;height:1.5pt" o:hralign="center" o:hrstd="t" o:hr="t" fillcolor="#a0a0a0" stroked="f"/>
+          <v:rect id="_x0000_i1034" style="width:0;height:1.5pt" o:hralign="center" o:hrstd="t" o:hr="t" fillcolor="#a0a0a0" stroked="f"/>
         </w:pict>
       </w:r>
     </w:p>
@@ -5327,6 +5975,7 @@
         <w:rPr>
           <w:color w:val="156082" w:themeColor="accent1"/>
         </w:rPr>
+        <w:lastRenderedPageBreak/>
         <w:t xml:space="preserve">  "estatus": "ACTIVO"</w:t>
       </w:r>
     </w:p>
@@ -5358,7 +6007,7 @@
     <w:p>
       <w:r>
         <w:pict w14:anchorId="4D820FCF">
-          <v:rect id="_x0000_i2184" style="width:0;height:1.5pt" o:hralign="center" o:hrstd="t" o:hr="t" fillcolor="#a0a0a0" stroked="f"/>
+          <v:rect id="_x0000_i1035" style="width:0;height:1.5pt" o:hralign="center" o:hrstd="t" o:hr="t" fillcolor="#a0a0a0" stroked="f"/>
         </w:pict>
       </w:r>
     </w:p>
@@ -5385,7 +6034,6 @@
         </w:numPr>
       </w:pPr>
       <w:r>
-        <w:lastRenderedPageBreak/>
         <w:t xml:space="preserve">Repite el proceso de </w:t>
       </w:r>
       <w:r>
@@ -5784,7 +6432,7 @@
     <w:p>
       <w:r>
         <w:pict w14:anchorId="11A5612D">
-          <v:rect id="_x0000_i2185" style="width:0;height:1.5pt" o:hralign="center" o:hrstd="t" o:hr="t" fillcolor="#a0a0a0" stroked="f"/>
+          <v:rect id="_x0000_i1036" style="width:0;height:1.5pt" o:hralign="center" o:hrstd="t" o:hr="t" fillcolor="#a0a0a0" stroked="f"/>
         </w:pict>
       </w:r>
     </w:p>
@@ -6187,6 +6835,7 @@
         </w:numPr>
       </w:pPr>
       <w:r>
+        <w:lastRenderedPageBreak/>
         <w:t>Revisa que la respuesta muestre el contrat</w:t>
       </w:r>
       <w:r>
@@ -6294,7 +6943,6 @@
         </w:numPr>
       </w:pPr>
       <w:r>
-        <w:lastRenderedPageBreak/>
         <w:t>Envía un JSON con $Tipo: "</w:t>
       </w:r>
       <w:proofErr w:type="spellStart"/>
@@ -6557,10 +7205,7 @@
         <w:t xml:space="preserve"> /F2_PreparacionFabricacion/Contratos</w:t>
       </w:r>
       <w:r>
-        <w:t xml:space="preserve"> los cambios</w:t>
-      </w:r>
-      <w:r>
-        <w:t>.</w:t>
+        <w:t xml:space="preserve"> los cambios.</w:t>
       </w:r>
     </w:p>
     <w:p>
@@ -6712,10 +7357,7 @@
         <w:t xml:space="preserve"> /F2_PreparacionFabricacion/Contratos</w:t>
       </w:r>
       <w:r>
-        <w:t xml:space="preserve"> los cambios</w:t>
-      </w:r>
-      <w:r>
-        <w:t>.</w:t>
+        <w:t xml:space="preserve"> los cambios.</w:t>
       </w:r>
     </w:p>
     <w:p/>
@@ -6759,14 +7401,7 @@
           <w:b/>
           <w:bCs/>
         </w:rPr>
-        <w:t>particular existente</w:t>
-      </w:r>
-      <w:r>
-        <w:rPr>
-          <w:b/>
-          <w:bCs/>
-        </w:rPr>
-        <w:t xml:space="preserve"> con una URL de archivo incorrecta (ejem: c:/Mis documentos)</w:t>
+        <w:t>particular existente con una URL de archivo incorrecta (ejem: c:/Mis documentos)</w:t>
       </w:r>
       <w:r>
         <w:rPr>
@@ -6907,28 +7542,24 @@
         <w:pStyle w:val="Textoindependiente"/>
         <w:numPr>
           <w:ilvl w:val="0"/>
-          <w:numId w:val="30"/>
+          <w:numId w:val="37"/>
         </w:numPr>
       </w:pPr>
-      <w:proofErr w:type="spellStart"/>
-      <w:r>
-        <w:rPr>
-          <w:b/>
-          <w:bCs/>
-        </w:rPr>
-        <w:t>Endpoint</w:t>
-      </w:r>
-      <w:proofErr w:type="spellEnd"/>
-      <w:r>
-        <w:rPr>
-          <w:b/>
-          <w:bCs/>
-        </w:rPr>
-        <w:t>:</w:t>
-      </w:r>
-      <w:r>
-        <w:br/>
-        <w:t>/F1_ConfiguracionInicial/</w:t>
+      <w:r>
+        <w:t xml:space="preserve">Selecciona </w:t>
+      </w:r>
+      <w:r>
+        <w:rPr>
+          <w:b/>
+          <w:bCs/>
+        </w:rPr>
+        <w:t>POST</w:t>
+      </w:r>
+      <w:r>
+        <w:t xml:space="preserve"> /</w:t>
+      </w:r>
+      <w:r>
+        <w:t>F1_ConfiguracionInicial/</w:t>
       </w:r>
       <w:proofErr w:type="spellStart"/>
       <w:r>
@@ -6941,18 +7572,46 @@
         <w:pStyle w:val="Textoindependiente"/>
         <w:numPr>
           <w:ilvl w:val="0"/>
-          <w:numId w:val="30"/>
+          <w:numId w:val="37"/>
         </w:numPr>
       </w:pPr>
       <w:r>
-        <w:rPr>
-          <w:b/>
-          <w:bCs/>
-        </w:rPr>
-        <w:t>Método:</w:t>
-      </w:r>
-      <w:r>
-        <w:t xml:space="preserve"> POST</w:t>
+        <w:t xml:space="preserve">Pulsa el botón </w:t>
+      </w:r>
+      <w:r>
+        <w:rPr>
+          <w:b/>
+          <w:bCs/>
+        </w:rPr>
+        <w:t xml:space="preserve">Try </w:t>
+      </w:r>
+      <w:proofErr w:type="spellStart"/>
+      <w:r>
+        <w:rPr>
+          <w:b/>
+          <w:bCs/>
+        </w:rPr>
+        <w:t>it</w:t>
+      </w:r>
+      <w:proofErr w:type="spellEnd"/>
+      <w:r>
+        <w:rPr>
+          <w:b/>
+          <w:bCs/>
+        </w:rPr>
+        <w:t xml:space="preserve"> </w:t>
+      </w:r>
+      <w:proofErr w:type="spellStart"/>
+      <w:r>
+        <w:rPr>
+          <w:b/>
+          <w:bCs/>
+        </w:rPr>
+        <w:t>out</w:t>
+      </w:r>
+      <w:proofErr w:type="spellEnd"/>
+      <w:r>
+        <w:t xml:space="preserve"> (Probar).</w:t>
       </w:r>
     </w:p>
     <w:p>
@@ -6960,18 +7619,216 @@
         <w:pStyle w:val="Textoindependiente"/>
         <w:numPr>
           <w:ilvl w:val="0"/>
-          <w:numId w:val="30"/>
+          <w:numId w:val="37"/>
         </w:numPr>
       </w:pPr>
       <w:r>
-        <w:rPr>
-          <w:b/>
-          <w:bCs/>
-        </w:rPr>
-        <w:t>Descripción:</w:t>
-      </w:r>
-      <w:r>
-        <w:t xml:space="preserve"> Agrega una nueva prueba o documento al registro.</w:t>
+        <w:t xml:space="preserve">En el cuadro </w:t>
+      </w:r>
+      <w:proofErr w:type="spellStart"/>
+      <w:r>
+        <w:rPr>
+          <w:b/>
+          <w:bCs/>
+        </w:rPr>
+        <w:t>Request</w:t>
+      </w:r>
+      <w:proofErr w:type="spellEnd"/>
+      <w:r>
+        <w:rPr>
+          <w:b/>
+          <w:bCs/>
+        </w:rPr>
+        <w:t xml:space="preserve"> </w:t>
+      </w:r>
+      <w:proofErr w:type="spellStart"/>
+      <w:r>
+        <w:rPr>
+          <w:b/>
+          <w:bCs/>
+        </w:rPr>
+        <w:t>body</w:t>
+      </w:r>
+      <w:proofErr w:type="spellEnd"/>
+      <w:r>
+        <w:t>, pega el siguiente JSON de ejemplo:</w:t>
+      </w:r>
+    </w:p>
+    <w:p>
+      <w:pPr>
+        <w:pStyle w:val="Textoindependiente"/>
+        <w:ind w:left="720"/>
+        <w:rPr>
+          <w:color w:val="156082" w:themeColor="accent1"/>
+        </w:rPr>
+      </w:pPr>
+      <w:r>
+        <w:rPr>
+          <w:color w:val="156082" w:themeColor="accent1"/>
+        </w:rPr>
+        <w:t>{</w:t>
+      </w:r>
+    </w:p>
+    <w:p>
+      <w:pPr>
+        <w:pStyle w:val="Textoindependiente"/>
+        <w:ind w:left="720"/>
+        <w:rPr>
+          <w:color w:val="156082" w:themeColor="accent1"/>
+        </w:rPr>
+      </w:pPr>
+      <w:r>
+        <w:rPr>
+          <w:color w:val="156082" w:themeColor="accent1"/>
+        </w:rPr>
+        <w:t xml:space="preserve">  "</w:t>
+      </w:r>
+      <w:proofErr w:type="spellStart"/>
+      <w:r>
+        <w:rPr>
+          <w:color w:val="156082" w:themeColor="accent1"/>
+        </w:rPr>
+        <w:t>tipoDocumento</w:t>
+      </w:r>
+      <w:proofErr w:type="spellEnd"/>
+      <w:r>
+        <w:rPr>
+          <w:color w:val="156082" w:themeColor="accent1"/>
+        </w:rPr>
+        <w:t>": "</w:t>
+      </w:r>
+      <w:proofErr w:type="spellStart"/>
+      <w:r>
+        <w:rPr>
+          <w:color w:val="156082" w:themeColor="accent1"/>
+        </w:rPr>
+        <w:t>PruebasRutina</w:t>
+      </w:r>
+      <w:proofErr w:type="spellEnd"/>
+      <w:r>
+        <w:rPr>
+          <w:color w:val="156082" w:themeColor="accent1"/>
+        </w:rPr>
+        <w:t>",</w:t>
+      </w:r>
+    </w:p>
+    <w:p>
+      <w:pPr>
+        <w:pStyle w:val="Textoindependiente"/>
+        <w:ind w:left="720"/>
+        <w:rPr>
+          <w:color w:val="156082" w:themeColor="accent1"/>
+        </w:rPr>
+      </w:pPr>
+      <w:r>
+        <w:rPr>
+          <w:color w:val="156082" w:themeColor="accent1"/>
+        </w:rPr>
+        <w:t xml:space="preserve">  "</w:t>
+      </w:r>
+      <w:proofErr w:type="spellStart"/>
+      <w:r>
+        <w:rPr>
+          <w:color w:val="156082" w:themeColor="accent1"/>
+        </w:rPr>
+        <w:t>descripcionDocumento</w:t>
+      </w:r>
+      <w:proofErr w:type="spellEnd"/>
+      <w:r>
+        <w:rPr>
+          <w:color w:val="156082" w:themeColor="accent1"/>
+        </w:rPr>
+        <w:t>": "Prueba de rutina al equipo",</w:t>
+      </w:r>
+    </w:p>
+    <w:p>
+      <w:pPr>
+        <w:pStyle w:val="Textoindependiente"/>
+        <w:ind w:left="720"/>
+        <w:rPr>
+          <w:color w:val="156082" w:themeColor="accent1"/>
+        </w:rPr>
+      </w:pPr>
+      <w:r>
+        <w:rPr>
+          <w:color w:val="156082" w:themeColor="accent1"/>
+        </w:rPr>
+        <w:t xml:space="preserve">  "</w:t>
+      </w:r>
+      <w:proofErr w:type="spellStart"/>
+      <w:r>
+        <w:rPr>
+          <w:color w:val="156082" w:themeColor="accent1"/>
+        </w:rPr>
+        <w:t>urlArchivo</w:t>
+      </w:r>
+      <w:proofErr w:type="spellEnd"/>
+      <w:r>
+        <w:rPr>
+          <w:color w:val="156082" w:themeColor="accent1"/>
+        </w:rPr>
+        <w:t>": "https://www.cfe.mx",</w:t>
+      </w:r>
+    </w:p>
+    <w:p>
+      <w:pPr>
+        <w:pStyle w:val="Textoindependiente"/>
+        <w:ind w:left="720"/>
+        <w:rPr>
+          <w:color w:val="156082" w:themeColor="accent1"/>
+        </w:rPr>
+      </w:pPr>
+      <w:r>
+        <w:rPr>
+          <w:color w:val="156082" w:themeColor="accent1"/>
+        </w:rPr>
+        <w:t xml:space="preserve">  "mD5": "",</w:t>
+      </w:r>
+    </w:p>
+    <w:p>
+      <w:pPr>
+        <w:pStyle w:val="Textoindependiente"/>
+        <w:ind w:left="720"/>
+        <w:rPr>
+          <w:color w:val="156082" w:themeColor="accent1"/>
+        </w:rPr>
+      </w:pPr>
+      <w:r>
+        <w:rPr>
+          <w:color w:val="156082" w:themeColor="accent1"/>
+        </w:rPr>
+        <w:lastRenderedPageBreak/>
+        <w:t xml:space="preserve">  "estatus": "ACTIVO",</w:t>
+      </w:r>
+    </w:p>
+    <w:p>
+      <w:pPr>
+        <w:pStyle w:val="Textoindependiente"/>
+        <w:ind w:left="720"/>
+        <w:rPr>
+          <w:color w:val="156082" w:themeColor="accent1"/>
+        </w:rPr>
+      </w:pPr>
+      <w:r>
+        <w:rPr>
+          <w:color w:val="156082" w:themeColor="accent1"/>
+        </w:rPr>
+        <w:t xml:space="preserve">  "vigencia": "2026-02-09T06:00:00Z"</w:t>
+      </w:r>
+    </w:p>
+    <w:p>
+      <w:pPr>
+        <w:pStyle w:val="Textoindependiente"/>
+        <w:ind w:left="720"/>
+        <w:rPr>
+          <w:color w:val="156082" w:themeColor="accent1"/>
+        </w:rPr>
+      </w:pPr>
+      <w:r>
+        <w:rPr>
+          <w:color w:val="156082" w:themeColor="accent1"/>
+        </w:rPr>
+        <w:t>}</w:t>
       </w:r>
     </w:p>
     <w:p>
@@ -6979,109 +7836,23 @@
         <w:pStyle w:val="Textoindependiente"/>
         <w:numPr>
           <w:ilvl w:val="0"/>
-          <w:numId w:val="30"/>
+          <w:numId w:val="38"/>
         </w:numPr>
       </w:pPr>
       <w:r>
-        <w:rPr>
-          <w:b/>
-          <w:bCs/>
-        </w:rPr>
-        <w:t xml:space="preserve">Cuerpo de la petición (JSON – </w:t>
-      </w:r>
-      <w:proofErr w:type="spellStart"/>
-      <w:r>
-        <w:rPr>
-          <w:b/>
-          <w:bCs/>
-        </w:rPr>
-        <w:t>OtrasPruebasYDocumentosDTO</w:t>
-      </w:r>
-      <w:proofErr w:type="spellEnd"/>
-      <w:r>
-        <w:rPr>
-          <w:b/>
-          <w:bCs/>
-        </w:rPr>
-        <w:t>):</w:t>
-      </w:r>
-    </w:p>
-    <w:p>
-      <w:pPr>
-        <w:pStyle w:val="Textoindependiente"/>
-        <w:ind w:left="720"/>
-      </w:pPr>
-      <w:r>
-        <w:t>{</w:t>
-      </w:r>
-    </w:p>
-    <w:p>
-      <w:pPr>
-        <w:pStyle w:val="Textoindependiente"/>
-        <w:ind w:left="720"/>
-      </w:pPr>
-      <w:r>
-        <w:t xml:space="preserve">  "</w:t>
-      </w:r>
-      <w:proofErr w:type="spellStart"/>
-      <w:r>
-        <w:t>tipoDocumento</w:t>
-      </w:r>
-      <w:proofErr w:type="spellEnd"/>
-      <w:r>
-        <w:t>": "Prueba Rutina",</w:t>
-      </w:r>
-    </w:p>
-    <w:p>
-      <w:pPr>
-        <w:pStyle w:val="Textoindependiente"/>
-        <w:ind w:left="720"/>
-      </w:pPr>
-      <w:r>
-        <w:t xml:space="preserve">  "</w:t>
-      </w:r>
-      <w:proofErr w:type="spellStart"/>
-      <w:r>
-        <w:t>descripcion</w:t>
-      </w:r>
-      <w:proofErr w:type="spellEnd"/>
-      <w:r>
-        <w:t>": "Prueba de cortocircuito trifásico",</w:t>
-      </w:r>
-    </w:p>
-    <w:p>
-      <w:pPr>
-        <w:pStyle w:val="Textoindependiente"/>
-        <w:ind w:left="720"/>
-      </w:pPr>
-      <w:r>
-        <w:t xml:space="preserve">  "</w:t>
-      </w:r>
-      <w:proofErr w:type="spellStart"/>
-      <w:r>
-        <w:t>fechaRegistro</w:t>
-      </w:r>
-      <w:proofErr w:type="spellEnd"/>
-      <w:r>
-        <w:t>": "2025-03-04T12:00:00Z",</w:t>
-      </w:r>
-    </w:p>
-    <w:p>
-      <w:pPr>
-        <w:pStyle w:val="Textoindependiente"/>
-        <w:ind w:left="720"/>
-      </w:pPr>
-      <w:r>
-        <w:t xml:space="preserve">  "estatus": "Activo"</w:t>
-      </w:r>
-    </w:p>
-    <w:p>
-      <w:pPr>
-        <w:pStyle w:val="Textoindependiente"/>
-        <w:ind w:left="720"/>
-      </w:pPr>
-      <w:r>
-        <w:t>}</w:t>
+        <w:t xml:space="preserve">Da clic en </w:t>
+      </w:r>
+      <w:proofErr w:type="spellStart"/>
+      <w:r>
+        <w:rPr>
+          <w:b/>
+          <w:bCs/>
+        </w:rPr>
+        <w:t>Execute</w:t>
+      </w:r>
+      <w:proofErr w:type="spellEnd"/>
+      <w:r>
+        <w:t>.</w:t>
       </w:r>
     </w:p>
     <w:p>
@@ -7089,192 +7860,38 @@
         <w:pStyle w:val="Textoindependiente"/>
         <w:numPr>
           <w:ilvl w:val="0"/>
-          <w:numId w:val="31"/>
+          <w:numId w:val="38"/>
         </w:numPr>
       </w:pPr>
       <w:r>
-        <w:rPr>
-          <w:b/>
-          <w:bCs/>
-        </w:rPr>
-        <w:lastRenderedPageBreak/>
-        <w:t>Respuesta esperada (200 OK):</w:t>
-      </w:r>
-    </w:p>
-    <w:p>
-      <w:pPr>
-        <w:pStyle w:val="Textoindependiente"/>
-        <w:ind w:left="708"/>
-        <w:rPr>
-          <w:color w:val="156082" w:themeColor="accent1"/>
-        </w:rPr>
-      </w:pPr>
-      <w:r>
-        <w:rPr>
-          <w:color w:val="156082" w:themeColor="accent1"/>
-        </w:rPr>
-        <w:t>{</w:t>
-      </w:r>
-    </w:p>
-    <w:p>
-      <w:pPr>
-        <w:pStyle w:val="Textoindependiente"/>
-        <w:ind w:left="708"/>
-        <w:rPr>
-          <w:color w:val="156082" w:themeColor="accent1"/>
-        </w:rPr>
-      </w:pPr>
-      <w:r>
-        <w:rPr>
-          <w:color w:val="156082" w:themeColor="accent1"/>
-        </w:rPr>
-        <w:t xml:space="preserve">  "id": "68b9c3f7ce4fbe620abc2c4d",</w:t>
-      </w:r>
-    </w:p>
-    <w:p>
-      <w:pPr>
-        <w:pStyle w:val="Textoindependiente"/>
-        <w:ind w:left="708"/>
-        <w:rPr>
-          <w:color w:val="156082" w:themeColor="accent1"/>
-        </w:rPr>
-      </w:pPr>
-      <w:r>
-        <w:rPr>
-          <w:color w:val="156082" w:themeColor="accent1"/>
-        </w:rPr>
-        <w:t xml:space="preserve">  "</w:t>
-      </w:r>
-      <w:proofErr w:type="spellStart"/>
-      <w:r>
-        <w:rPr>
-          <w:color w:val="156082" w:themeColor="accent1"/>
-        </w:rPr>
-        <w:t>tipoDocumento</w:t>
-      </w:r>
-      <w:proofErr w:type="spellEnd"/>
-      <w:r>
-        <w:rPr>
-          <w:color w:val="156082" w:themeColor="accent1"/>
-        </w:rPr>
-        <w:t>": "Prueba Rutina",</w:t>
-      </w:r>
-    </w:p>
-    <w:p>
-      <w:pPr>
-        <w:pStyle w:val="Textoindependiente"/>
-        <w:ind w:left="708"/>
-        <w:rPr>
-          <w:color w:val="156082" w:themeColor="accent1"/>
-        </w:rPr>
-      </w:pPr>
-      <w:r>
-        <w:rPr>
-          <w:color w:val="156082" w:themeColor="accent1"/>
-        </w:rPr>
-        <w:t xml:space="preserve">  "</w:t>
-      </w:r>
-      <w:proofErr w:type="spellStart"/>
-      <w:r>
-        <w:rPr>
-          <w:color w:val="156082" w:themeColor="accent1"/>
-        </w:rPr>
-        <w:t>descripcion</w:t>
-      </w:r>
-      <w:proofErr w:type="spellEnd"/>
-      <w:r>
-        <w:rPr>
-          <w:color w:val="156082" w:themeColor="accent1"/>
-        </w:rPr>
-        <w:t>": "Prueba de cortocircuito trifásico",</w:t>
-      </w:r>
-    </w:p>
-    <w:p>
-      <w:pPr>
-        <w:pStyle w:val="Textoindependiente"/>
-        <w:ind w:left="708"/>
-        <w:rPr>
-          <w:color w:val="156082" w:themeColor="accent1"/>
-        </w:rPr>
-      </w:pPr>
-      <w:r>
-        <w:rPr>
-          <w:color w:val="156082" w:themeColor="accent1"/>
-        </w:rPr>
-        <w:t xml:space="preserve">  "</w:t>
-      </w:r>
-      <w:proofErr w:type="spellStart"/>
-      <w:r>
-        <w:rPr>
-          <w:color w:val="156082" w:themeColor="accent1"/>
-        </w:rPr>
-        <w:t>fechaRegistro</w:t>
-      </w:r>
-      <w:proofErr w:type="spellEnd"/>
-      <w:r>
-        <w:rPr>
-          <w:color w:val="156082" w:themeColor="accent1"/>
-        </w:rPr>
-        <w:t>": "2025-03-04T12:00:00Z",</w:t>
-      </w:r>
-    </w:p>
-    <w:p>
-      <w:pPr>
-        <w:pStyle w:val="Textoindependiente"/>
-        <w:ind w:left="708"/>
-        <w:rPr>
-          <w:color w:val="156082" w:themeColor="accent1"/>
-        </w:rPr>
-      </w:pPr>
-      <w:r>
-        <w:rPr>
-          <w:color w:val="156082" w:themeColor="accent1"/>
-        </w:rPr>
-        <w:t xml:space="preserve">  "estatus": "Activo"</w:t>
-      </w:r>
-    </w:p>
-    <w:p>
-      <w:r>
-        <w:rPr>
-          <w:color w:val="156082" w:themeColor="accent1"/>
-        </w:rPr>
-        <w:t>}</w:t>
-      </w:r>
-    </w:p>
-    <w:p/>
-    <w:p>
-      <w:pPr>
-        <w:rPr>
-          <w:b/>
-          <w:bCs/>
-        </w:rPr>
-      </w:pPr>
-      <w:r>
-        <w:rPr>
-          <w:b/>
-          <w:bCs/>
-        </w:rPr>
-        <w:t xml:space="preserve">Actividad </w:t>
-      </w:r>
-      <w:r>
-        <w:rPr>
-          <w:b/>
-          <w:bCs/>
-        </w:rPr>
-        <w:t>10</w:t>
-      </w:r>
-      <w:r>
-        <w:rPr>
-          <w:b/>
-          <w:bCs/>
-        </w:rPr>
-        <w:t xml:space="preserve"> -</w:t>
-      </w:r>
-      <w:r>
-        <w:rPr>
-          <w:b/>
-          <w:bCs/>
-        </w:rPr>
+        <w:t xml:space="preserve">Verifica que la respuesta sea </w:t>
+      </w:r>
+      <w:r>
+        <w:rPr>
+          <w:b/>
+          <w:bCs/>
+        </w:rPr>
+        <w:t>200 OK</w:t>
+      </w:r>
+      <w:r>
+        <w:t xml:space="preserve"> y que el sistema confirme el registro.</w:t>
+      </w:r>
+    </w:p>
+    <w:p>
+      <w:pPr>
+        <w:rPr>
+          <w:b/>
+          <w:bCs/>
+        </w:rPr>
+      </w:pPr>
+      <w:r>
+        <w:rPr>
+          <w:b/>
+          <w:bCs/>
+        </w:rPr>
+        <w:t>Actividad 10 -</w:t>
+      </w:r>
+      <w:r>
         <w:t xml:space="preserve"> </w:t>
       </w:r>
       <w:r>
@@ -7282,35 +7899,33 @@
           <w:b/>
           <w:bCs/>
         </w:rPr>
-        <w:t>Actualizar una prueba o documento existente (PUT)</w:t>
-      </w:r>
-    </w:p>
-    <w:p>
-      <w:pPr>
-        <w:pStyle w:val="Textoindependiente"/>
+        <w:t>Consultar los registros existentes (GET)</w:t>
+      </w:r>
+    </w:p>
+    <w:p>
+      <w:pPr>
         <w:numPr>
           <w:ilvl w:val="0"/>
-          <w:numId w:val="32"/>
+          <w:numId w:val="39"/>
         </w:numPr>
       </w:pPr>
-      <w:proofErr w:type="spellStart"/>
-      <w:r>
-        <w:rPr>
-          <w:b/>
-          <w:bCs/>
-        </w:rPr>
-        <w:t>Endpoint</w:t>
-      </w:r>
-      <w:proofErr w:type="spellEnd"/>
-      <w:r>
-        <w:rPr>
-          <w:b/>
-          <w:bCs/>
-        </w:rPr>
-        <w:t>:</w:t>
-      </w:r>
-      <w:r>
-        <w:br/>
+      <w:r>
+        <w:t>Selecciona</w:t>
+      </w:r>
+      <w:r>
+        <w:t xml:space="preserve"> </w:t>
+      </w:r>
+      <w:r>
+        <w:rPr>
+          <w:b/>
+          <w:bCs/>
+        </w:rPr>
+        <w:t>GET</w:t>
+      </w:r>
+      <w:r>
+        <w:t xml:space="preserve"> </w:t>
+      </w:r>
+      <w:r>
         <w:t>/F1_ConfiguracionInicial/</w:t>
       </w:r>
       <w:proofErr w:type="spellStart"/>
@@ -7321,271 +7936,716 @@
     </w:p>
     <w:p>
       <w:pPr>
-        <w:pStyle w:val="Textoindependiente"/>
         <w:numPr>
           <w:ilvl w:val="0"/>
-          <w:numId w:val="32"/>
+          <w:numId w:val="39"/>
         </w:numPr>
       </w:pPr>
       <w:r>
-        <w:rPr>
-          <w:b/>
-          <w:bCs/>
-        </w:rPr>
-        <w:t>Método:</w:t>
-      </w:r>
-      <w:r>
-        <w:t xml:space="preserve"> PUT</w:t>
-      </w:r>
-    </w:p>
-    <w:p>
-      <w:pPr>
-        <w:pStyle w:val="Textoindependiente"/>
+        <w:t xml:space="preserve">Pulsa el botón </w:t>
+      </w:r>
+      <w:r>
+        <w:rPr>
+          <w:b/>
+          <w:bCs/>
+        </w:rPr>
+        <w:t xml:space="preserve">Try </w:t>
+      </w:r>
+      <w:proofErr w:type="spellStart"/>
+      <w:r>
+        <w:rPr>
+          <w:b/>
+          <w:bCs/>
+        </w:rPr>
+        <w:t>it</w:t>
+      </w:r>
+      <w:proofErr w:type="spellEnd"/>
+      <w:r>
+        <w:rPr>
+          <w:b/>
+          <w:bCs/>
+        </w:rPr>
+        <w:t xml:space="preserve"> </w:t>
+      </w:r>
+      <w:proofErr w:type="spellStart"/>
+      <w:r>
+        <w:rPr>
+          <w:b/>
+          <w:bCs/>
+        </w:rPr>
+        <w:t>out</w:t>
+      </w:r>
+      <w:proofErr w:type="spellEnd"/>
+      <w:r>
+        <w:t xml:space="preserve"> y luego </w:t>
+      </w:r>
+      <w:proofErr w:type="spellStart"/>
+      <w:r>
+        <w:rPr>
+          <w:b/>
+          <w:bCs/>
+        </w:rPr>
+        <w:t>Execute</w:t>
+      </w:r>
+      <w:proofErr w:type="spellEnd"/>
+      <w:r>
+        <w:t>.</w:t>
+      </w:r>
+    </w:p>
+    <w:p>
+      <w:pPr>
         <w:numPr>
           <w:ilvl w:val="0"/>
-          <w:numId w:val="32"/>
+          <w:numId w:val="39"/>
         </w:numPr>
       </w:pPr>
       <w:r>
-        <w:rPr>
-          <w:b/>
-          <w:bCs/>
-        </w:rPr>
-        <w:t>Descripción:</w:t>
-      </w:r>
-      <w:r>
-        <w:t xml:space="preserve"> Actualiza una prueba o documento previamente registrado.</w:t>
-      </w:r>
-    </w:p>
-    <w:p>
-      <w:pPr>
-        <w:pStyle w:val="Textoindependiente"/>
+        <w:t xml:space="preserve">Observa que la respuesta es un </w:t>
+      </w:r>
+      <w:r>
+        <w:rPr>
+          <w:b/>
+          <w:bCs/>
+        </w:rPr>
+        <w:t>array JSON</w:t>
+      </w:r>
+      <w:r>
+        <w:t xml:space="preserve"> con los documentos registrados.</w:t>
+      </w:r>
+    </w:p>
+    <w:p>
+      <w:r>
+        <w:t>Ejemplo de respuesta esperada:</w:t>
+      </w:r>
+    </w:p>
+    <w:p>
+      <w:pPr>
+        <w:ind w:left="708"/>
+        <w:rPr>
+          <w:color w:val="156082" w:themeColor="accent1"/>
+        </w:rPr>
+      </w:pPr>
+      <w:r>
+        <w:rPr>
+          <w:color w:val="156082" w:themeColor="accent1"/>
+        </w:rPr>
+        <w:t>[  {</w:t>
+      </w:r>
+    </w:p>
+    <w:p>
+      <w:pPr>
+        <w:ind w:left="708"/>
+        <w:rPr>
+          <w:color w:val="156082" w:themeColor="accent1"/>
+        </w:rPr>
+      </w:pPr>
+      <w:r>
+        <w:rPr>
+          <w:color w:val="156082" w:themeColor="accent1"/>
+        </w:rPr>
+        <w:t xml:space="preserve">    "id": "68b0eab5c86b8df36bdb5583",</w:t>
+      </w:r>
+    </w:p>
+    <w:p>
+      <w:pPr>
+        <w:ind w:left="708"/>
+        <w:rPr>
+          <w:color w:val="156082" w:themeColor="accent1"/>
+        </w:rPr>
+      </w:pPr>
+      <w:r>
+        <w:rPr>
+          <w:color w:val="156082" w:themeColor="accent1"/>
+        </w:rPr>
+        <w:t xml:space="preserve">    "</w:t>
+      </w:r>
+      <w:proofErr w:type="spellStart"/>
+      <w:r>
+        <w:rPr>
+          <w:color w:val="156082" w:themeColor="accent1"/>
+        </w:rPr>
+        <w:t>tipoDocumento</w:t>
+      </w:r>
+      <w:proofErr w:type="spellEnd"/>
+      <w:r>
+        <w:rPr>
+          <w:color w:val="156082" w:themeColor="accent1"/>
+        </w:rPr>
+        <w:t>": "</w:t>
+      </w:r>
+      <w:proofErr w:type="spellStart"/>
+      <w:r>
+        <w:rPr>
+          <w:color w:val="156082" w:themeColor="accent1"/>
+        </w:rPr>
+        <w:t>PruebasRutina</w:t>
+      </w:r>
+      <w:proofErr w:type="spellEnd"/>
+      <w:r>
+        <w:rPr>
+          <w:color w:val="156082" w:themeColor="accent1"/>
+        </w:rPr>
+        <w:t>",</w:t>
+      </w:r>
+    </w:p>
+    <w:p>
+      <w:pPr>
+        <w:ind w:left="708"/>
+        <w:rPr>
+          <w:color w:val="156082" w:themeColor="accent1"/>
+        </w:rPr>
+      </w:pPr>
+      <w:r>
+        <w:rPr>
+          <w:color w:val="156082" w:themeColor="accent1"/>
+        </w:rPr>
+        <w:t xml:space="preserve">    "</w:t>
+      </w:r>
+      <w:proofErr w:type="spellStart"/>
+      <w:r>
+        <w:rPr>
+          <w:color w:val="156082" w:themeColor="accent1"/>
+        </w:rPr>
+        <w:t>descripcionDocumento</w:t>
+      </w:r>
+      <w:proofErr w:type="spellEnd"/>
+      <w:r>
+        <w:rPr>
+          <w:color w:val="156082" w:themeColor="accent1"/>
+        </w:rPr>
+        <w:t>": "Prueba de rutina al equipo",</w:t>
+      </w:r>
+    </w:p>
+    <w:p>
+      <w:pPr>
+        <w:ind w:left="708"/>
+        <w:rPr>
+          <w:color w:val="156082" w:themeColor="accent1"/>
+        </w:rPr>
+      </w:pPr>
+      <w:r>
+        <w:rPr>
+          <w:color w:val="156082" w:themeColor="accent1"/>
+        </w:rPr>
+        <w:t xml:space="preserve">    "</w:t>
+      </w:r>
+      <w:proofErr w:type="spellStart"/>
+      <w:r>
+        <w:rPr>
+          <w:color w:val="156082" w:themeColor="accent1"/>
+        </w:rPr>
+        <w:t>urlArchivo</w:t>
+      </w:r>
+      <w:proofErr w:type="spellEnd"/>
+      <w:r>
+        <w:rPr>
+          <w:color w:val="156082" w:themeColor="accent1"/>
+        </w:rPr>
+        <w:t>": "https://www.cfe.mx",</w:t>
+      </w:r>
+    </w:p>
+    <w:p>
+      <w:pPr>
+        <w:ind w:left="708"/>
+        <w:rPr>
+          <w:color w:val="156082" w:themeColor="accent1"/>
+        </w:rPr>
+      </w:pPr>
+      <w:r>
+        <w:rPr>
+          <w:color w:val="156082" w:themeColor="accent1"/>
+        </w:rPr>
+        <w:t xml:space="preserve">    "mD5": "aec9e70f22caf811a92cac041d94223f",</w:t>
+      </w:r>
+    </w:p>
+    <w:p>
+      <w:pPr>
+        <w:ind w:left="708"/>
+        <w:rPr>
+          <w:color w:val="156082" w:themeColor="accent1"/>
+        </w:rPr>
+      </w:pPr>
+      <w:r>
+        <w:rPr>
+          <w:color w:val="156082" w:themeColor="accent1"/>
+        </w:rPr>
+        <w:t xml:space="preserve">    "estatus": "ACTIVO",</w:t>
+      </w:r>
+    </w:p>
+    <w:p>
+      <w:pPr>
+        <w:ind w:left="708"/>
+        <w:rPr>
+          <w:color w:val="156082" w:themeColor="accent1"/>
+        </w:rPr>
+      </w:pPr>
+      <w:r>
+        <w:rPr>
+          <w:color w:val="156082" w:themeColor="accent1"/>
+        </w:rPr>
+        <w:t xml:space="preserve">    "vigencia": "2026-02-09T06:00:00Z",</w:t>
+      </w:r>
+    </w:p>
+    <w:p>
+      <w:pPr>
+        <w:ind w:left="708"/>
+        <w:rPr>
+          <w:color w:val="156082" w:themeColor="accent1"/>
+        </w:rPr>
+      </w:pPr>
+      <w:r>
+        <w:rPr>
+          <w:color w:val="156082" w:themeColor="accent1"/>
+        </w:rPr>
+        <w:t xml:space="preserve">    "</w:t>
+      </w:r>
+      <w:proofErr w:type="spellStart"/>
+      <w:r>
+        <w:rPr>
+          <w:color w:val="156082" w:themeColor="accent1"/>
+        </w:rPr>
+        <w:t>fechaRegistro</w:t>
+      </w:r>
+      <w:proofErr w:type="spellEnd"/>
+      <w:r>
+        <w:rPr>
+          <w:color w:val="156082" w:themeColor="accent1"/>
+        </w:rPr>
+        <w:t>": "2025-08-28T23:47:32.832Z"</w:t>
+      </w:r>
+    </w:p>
+    <w:p>
+      <w:pPr>
+        <w:ind w:left="708"/>
+        <w:rPr>
+          <w:color w:val="156082" w:themeColor="accent1"/>
+        </w:rPr>
+      </w:pPr>
+      <w:r>
+        <w:rPr>
+          <w:color w:val="156082" w:themeColor="accent1"/>
+        </w:rPr>
+        <w:t xml:space="preserve">  }]</w:t>
+      </w:r>
+    </w:p>
+    <w:p/>
+    <w:p/>
+    <w:p>
+      <w:pPr>
+        <w:rPr>
+          <w:b/>
+          <w:bCs/>
+        </w:rPr>
+      </w:pPr>
+      <w:r>
+        <w:rPr>
+          <w:b/>
+          <w:bCs/>
+        </w:rPr>
+        <w:t xml:space="preserve">Actividad </w:t>
+      </w:r>
+      <w:r>
+        <w:rPr>
+          <w:b/>
+          <w:bCs/>
+        </w:rPr>
+        <w:t>1</w:t>
+      </w:r>
+      <w:r>
+        <w:rPr>
+          <w:b/>
+          <w:bCs/>
+        </w:rPr>
+        <w:t>1</w:t>
+      </w:r>
+      <w:r>
+        <w:rPr>
+          <w:b/>
+          <w:bCs/>
+        </w:rPr>
+        <w:t xml:space="preserve"> -</w:t>
+      </w:r>
+      <w:r>
+        <w:rPr>
+          <w:b/>
+          <w:bCs/>
+        </w:rPr>
+        <w:t xml:space="preserve"> </w:t>
+      </w:r>
+      <w:r>
+        <w:rPr>
+          <w:b/>
+          <w:bCs/>
+        </w:rPr>
+        <w:t>Actualizar una prueba o documento existente (PUT)</w:t>
+      </w:r>
+    </w:p>
+    <w:p>
+      <w:pPr>
         <w:numPr>
           <w:ilvl w:val="0"/>
-          <w:numId w:val="32"/>
+          <w:numId w:val="42"/>
         </w:numPr>
       </w:pPr>
       <w:r>
-        <w:rPr>
-          <w:b/>
-          <w:bCs/>
-        </w:rPr>
-        <w:t xml:space="preserve">Cuerpo de la petición (JSON – </w:t>
-      </w:r>
-      <w:proofErr w:type="spellStart"/>
-      <w:r>
-        <w:rPr>
-          <w:b/>
-          <w:bCs/>
-        </w:rPr>
-        <w:t>OtrasPruebasYDocumentosDTO</w:t>
-      </w:r>
-      <w:proofErr w:type="spellEnd"/>
-      <w:r>
-        <w:rPr>
-          <w:b/>
-          <w:bCs/>
-        </w:rPr>
-        <w:t>):</w:t>
-      </w:r>
-    </w:p>
-    <w:p>
-      <w:pPr>
-        <w:pStyle w:val="Textoindependiente"/>
-        <w:ind w:left="708"/>
-      </w:pPr>
-      <w:r>
-        <w:t>{</w:t>
-      </w:r>
-    </w:p>
-    <w:p>
-      <w:pPr>
-        <w:pStyle w:val="Textoindependiente"/>
-        <w:ind w:left="708"/>
-      </w:pPr>
-      <w:r>
-        <w:t xml:space="preserve">  "id": "68b9c3f7ce4fbe620abc2c4d",</w:t>
-      </w:r>
-    </w:p>
-    <w:p>
-      <w:pPr>
-        <w:pStyle w:val="Textoindependiente"/>
-        <w:ind w:left="708"/>
-      </w:pPr>
-      <w:r>
-        <w:t xml:space="preserve">  "</w:t>
-      </w:r>
-      <w:proofErr w:type="spellStart"/>
-      <w:r>
-        <w:t>tipoDocumento</w:t>
-      </w:r>
-      <w:proofErr w:type="spellEnd"/>
-      <w:r>
-        <w:t>": "Prueba Rutina",</w:t>
-      </w:r>
-    </w:p>
-    <w:p>
-      <w:pPr>
-        <w:pStyle w:val="Textoindependiente"/>
-        <w:ind w:left="708"/>
-      </w:pPr>
-      <w:r>
-        <w:t xml:space="preserve">  "</w:t>
-      </w:r>
-      <w:proofErr w:type="spellStart"/>
-      <w:r>
-        <w:t>descripcion</w:t>
-      </w:r>
-      <w:proofErr w:type="spellEnd"/>
-      <w:r>
-        <w:t>": "Prueba de cortocircuito actualizada",</w:t>
-      </w:r>
-    </w:p>
-    <w:p>
-      <w:pPr>
-        <w:pStyle w:val="Textoindependiente"/>
-        <w:ind w:left="708"/>
-      </w:pPr>
-      <w:r>
-        <w:t xml:space="preserve">  "</w:t>
-      </w:r>
-      <w:proofErr w:type="spellStart"/>
-      <w:r>
-        <w:t>fechaRegistro</w:t>
-      </w:r>
-      <w:proofErr w:type="spellEnd"/>
-      <w:r>
-        <w:t>": "2025-03-04T12:00:00Z",</w:t>
-      </w:r>
-    </w:p>
-    <w:p>
-      <w:pPr>
-        <w:pStyle w:val="Textoindependiente"/>
-        <w:ind w:left="708"/>
-      </w:pPr>
-      <w:r>
-        <w:t xml:space="preserve">  "estatus": "Activo"</w:t>
-      </w:r>
-    </w:p>
-    <w:p>
-      <w:pPr>
-        <w:pStyle w:val="Textoindependiente"/>
-        <w:ind w:left="708"/>
-      </w:pPr>
-      <w:r>
-        <w:t>}</w:t>
-      </w:r>
-    </w:p>
-    <w:p>
-      <w:pPr>
-        <w:pStyle w:val="Textoindependiente"/>
+        <w:t xml:space="preserve">Selecciona </w:t>
+      </w:r>
+      <w:r>
+        <w:rPr>
+          <w:b/>
+          <w:bCs/>
+        </w:rPr>
+        <w:t xml:space="preserve">PUT: </w:t>
+      </w:r>
+      <w:r>
+        <w:t>/F1_ConfiguracionInicial/</w:t>
+      </w:r>
+      <w:proofErr w:type="spellStart"/>
+      <w:r>
+        <w:t>OtrasPruebasYDocumentos</w:t>
+      </w:r>
+      <w:proofErr w:type="spellEnd"/>
+    </w:p>
+    <w:p>
+      <w:pPr>
         <w:numPr>
           <w:ilvl w:val="0"/>
-          <w:numId w:val="33"/>
+          <w:numId w:val="42"/>
         </w:numPr>
       </w:pPr>
       <w:r>
-        <w:rPr>
-          <w:b/>
-          <w:bCs/>
-        </w:rPr>
-        <w:t>Respuesta esperada (200 OK):</w:t>
-      </w:r>
-    </w:p>
-    <w:p>
-      <w:pPr>
-        <w:pStyle w:val="Textoindependiente"/>
-        <w:ind w:left="708"/>
-      </w:pPr>
-      <w:r>
+        <w:t xml:space="preserve">Copia el campo </w:t>
+      </w:r>
+      <w:r>
+        <w:rPr>
+          <w:b/>
+          <w:bCs/>
+        </w:rPr>
+        <w:t>id</w:t>
+      </w:r>
+      <w:r>
+        <w:t xml:space="preserve"> de uno de los registros obtenidos en el GET.</w:t>
+      </w:r>
+    </w:p>
+    <w:p>
+      <w:pPr>
+        <w:numPr>
+          <w:ilvl w:val="0"/>
+          <w:numId w:val="42"/>
+        </w:numPr>
+      </w:pPr>
+      <w:r>
+        <w:t xml:space="preserve">Pulsa el botón </w:t>
+      </w:r>
+      <w:r>
+        <w:rPr>
+          <w:b/>
+          <w:bCs/>
+        </w:rPr>
+        <w:t xml:space="preserve">Try </w:t>
+      </w:r>
+      <w:proofErr w:type="spellStart"/>
+      <w:r>
+        <w:rPr>
+          <w:b/>
+          <w:bCs/>
+        </w:rPr>
+        <w:t>it</w:t>
+      </w:r>
+      <w:proofErr w:type="spellEnd"/>
+      <w:r>
+        <w:rPr>
+          <w:b/>
+          <w:bCs/>
+        </w:rPr>
+        <w:t xml:space="preserve"> </w:t>
+      </w:r>
+      <w:proofErr w:type="spellStart"/>
+      <w:r>
+        <w:rPr>
+          <w:b/>
+          <w:bCs/>
+        </w:rPr>
+        <w:t>out</w:t>
+      </w:r>
+      <w:proofErr w:type="spellEnd"/>
+      <w:r>
+        <w:t>.</w:t>
+      </w:r>
+    </w:p>
+    <w:p>
+      <w:pPr>
+        <w:numPr>
+          <w:ilvl w:val="0"/>
+          <w:numId w:val="42"/>
+        </w:numPr>
+      </w:pPr>
+      <w:r>
+        <w:t xml:space="preserve">En el </w:t>
+      </w:r>
+      <w:proofErr w:type="spellStart"/>
+      <w:r>
+        <w:rPr>
+          <w:b/>
+          <w:bCs/>
+        </w:rPr>
+        <w:t>Request</w:t>
+      </w:r>
+      <w:proofErr w:type="spellEnd"/>
+      <w:r>
+        <w:rPr>
+          <w:b/>
+          <w:bCs/>
+        </w:rPr>
+        <w:t xml:space="preserve"> </w:t>
+      </w:r>
+      <w:proofErr w:type="spellStart"/>
+      <w:r>
+        <w:rPr>
+          <w:b/>
+          <w:bCs/>
+        </w:rPr>
+        <w:t>body</w:t>
+      </w:r>
+      <w:proofErr w:type="spellEnd"/>
+      <w:r>
+        <w:t xml:space="preserve">, pega el siguiente JSON, reemplazando el campo </w:t>
+      </w:r>
+      <w:r>
+        <w:rPr>
+          <w:b/>
+          <w:bCs/>
+        </w:rPr>
+        <w:t>id</w:t>
+      </w:r>
+      <w:r>
+        <w:t>:</w:t>
+      </w:r>
+    </w:p>
+    <w:p>
+      <w:pPr>
+        <w:ind w:left="720"/>
+        <w:rPr>
+          <w:color w:val="156082" w:themeColor="accent1"/>
+        </w:rPr>
+      </w:pPr>
+      <w:r>
+        <w:rPr>
+          <w:color w:val="156082" w:themeColor="accent1"/>
+        </w:rPr>
         <w:t>{</w:t>
       </w:r>
     </w:p>
     <w:p>
       <w:pPr>
-        <w:pStyle w:val="Textoindependiente"/>
-        <w:ind w:left="708"/>
-      </w:pPr>
-      <w:r>
-        <w:t xml:space="preserve">  "id": "68b9c3f7ce4fbe620abc2c4d",</w:t>
-      </w:r>
-    </w:p>
-    <w:p>
-      <w:pPr>
-        <w:pStyle w:val="Textoindependiente"/>
-        <w:ind w:left="708"/>
-      </w:pPr>
-      <w:r>
+        <w:ind w:left="720"/>
+        <w:rPr>
+          <w:color w:val="156082" w:themeColor="accent1"/>
+        </w:rPr>
+      </w:pPr>
+      <w:r>
+        <w:rPr>
+          <w:color w:val="156082" w:themeColor="accent1"/>
+        </w:rPr>
+        <w:t xml:space="preserve">  "id": "68b0eab5c86b8df36bdb5583",</w:t>
+      </w:r>
+    </w:p>
+    <w:p>
+      <w:pPr>
+        <w:ind w:left="720"/>
+        <w:rPr>
+          <w:color w:val="156082" w:themeColor="accent1"/>
+        </w:rPr>
+      </w:pPr>
+      <w:r>
+        <w:rPr>
+          <w:color w:val="156082" w:themeColor="accent1"/>
+        </w:rPr>
         <w:t xml:space="preserve">  "</w:t>
       </w:r>
       <w:proofErr w:type="spellStart"/>
       <w:r>
+        <w:rPr>
+          <w:color w:val="156082" w:themeColor="accent1"/>
+        </w:rPr>
         <w:t>tipoDocumento</w:t>
       </w:r>
       <w:proofErr w:type="spellEnd"/>
       <w:r>
-        <w:t>": "Prueba Rutina",</w:t>
-      </w:r>
-    </w:p>
-    <w:p>
-      <w:pPr>
-        <w:pStyle w:val="Textoindependiente"/>
-        <w:ind w:left="708"/>
-      </w:pPr>
-      <w:r>
+        <w:rPr>
+          <w:color w:val="156082" w:themeColor="accent1"/>
+        </w:rPr>
+        <w:t>": "</w:t>
+      </w:r>
+      <w:proofErr w:type="spellStart"/>
+      <w:r>
+        <w:rPr>
+          <w:color w:val="156082" w:themeColor="accent1"/>
+        </w:rPr>
+        <w:t>PruebasRutina</w:t>
+      </w:r>
+      <w:proofErr w:type="spellEnd"/>
+      <w:r>
+        <w:rPr>
+          <w:color w:val="156082" w:themeColor="accent1"/>
+        </w:rPr>
+        <w:t>",</w:t>
+      </w:r>
+    </w:p>
+    <w:p>
+      <w:pPr>
+        <w:ind w:left="720"/>
+        <w:rPr>
+          <w:color w:val="156082" w:themeColor="accent1"/>
+        </w:rPr>
+      </w:pPr>
+      <w:r>
+        <w:rPr>
+          <w:color w:val="156082" w:themeColor="accent1"/>
+        </w:rPr>
         <w:t xml:space="preserve">  "</w:t>
       </w:r>
       <w:proofErr w:type="spellStart"/>
       <w:r>
-        <w:t>descripcion</w:t>
-      </w:r>
-      <w:proofErr w:type="spellEnd"/>
-      <w:r>
-        <w:t>": "Prueba de cortocircuito actualizada",</w:t>
-      </w:r>
-    </w:p>
-    <w:p>
-      <w:pPr>
-        <w:pStyle w:val="Textoindependiente"/>
-        <w:ind w:left="708"/>
-      </w:pPr>
-      <w:r>
+        <w:rPr>
+          <w:color w:val="156082" w:themeColor="accent1"/>
+        </w:rPr>
+        <w:t>descripcionDocumento</w:t>
+      </w:r>
+      <w:proofErr w:type="spellEnd"/>
+      <w:r>
+        <w:rPr>
+          <w:color w:val="156082" w:themeColor="accent1"/>
+        </w:rPr>
+        <w:t>": "Prueba de rutina al equipo actualizado",</w:t>
+      </w:r>
+    </w:p>
+    <w:p>
+      <w:pPr>
+        <w:ind w:left="720"/>
+        <w:rPr>
+          <w:color w:val="156082" w:themeColor="accent1"/>
+        </w:rPr>
+      </w:pPr>
+      <w:r>
+        <w:rPr>
+          <w:color w:val="156082" w:themeColor="accent1"/>
+        </w:rPr>
         <w:t xml:space="preserve">  "</w:t>
       </w:r>
       <w:proofErr w:type="spellStart"/>
       <w:r>
-        <w:t>fechaRegistro</w:t>
-      </w:r>
-      <w:proofErr w:type="spellEnd"/>
-      <w:r>
-        <w:t>": "2025-03-04T12:00:00Z",</w:t>
-      </w:r>
-    </w:p>
-    <w:p>
-      <w:pPr>
-        <w:pStyle w:val="Textoindependiente"/>
-        <w:ind w:left="708"/>
-      </w:pPr>
-      <w:r>
-        <w:t xml:space="preserve">  "estatus": "Activo"</w:t>
-      </w:r>
-    </w:p>
-    <w:p>
-      <w:pPr>
-        <w:pStyle w:val="Textoindependiente"/>
-        <w:ind w:left="708"/>
-      </w:pPr>
-      <w:r>
+        <w:rPr>
+          <w:color w:val="156082" w:themeColor="accent1"/>
+        </w:rPr>
+        <w:t>urlArchivo</w:t>
+      </w:r>
+      <w:proofErr w:type="spellEnd"/>
+      <w:r>
+        <w:rPr>
+          <w:color w:val="156082" w:themeColor="accent1"/>
+        </w:rPr>
+        <w:t>": "https://www.cfe.mx/nueva-version",</w:t>
+      </w:r>
+    </w:p>
+    <w:p>
+      <w:pPr>
+        <w:ind w:left="720"/>
+        <w:rPr>
+          <w:color w:val="156082" w:themeColor="accent1"/>
+        </w:rPr>
+      </w:pPr>
+      <w:r>
+        <w:rPr>
+          <w:color w:val="156082" w:themeColor="accent1"/>
+        </w:rPr>
+        <w:t xml:space="preserve">  "mD5": "bbf1234567890caf811a92cac041d942",</w:t>
+      </w:r>
+    </w:p>
+    <w:p>
+      <w:pPr>
+        <w:ind w:left="720"/>
+        <w:rPr>
+          <w:color w:val="156082" w:themeColor="accent1"/>
+        </w:rPr>
+      </w:pPr>
+      <w:r>
+        <w:rPr>
+          <w:color w:val="156082" w:themeColor="accent1"/>
+        </w:rPr>
+        <w:t xml:space="preserve">  "estatus": "ACTIVO",</w:t>
+      </w:r>
+    </w:p>
+    <w:p>
+      <w:pPr>
+        <w:ind w:left="720"/>
+        <w:rPr>
+          <w:color w:val="156082" w:themeColor="accent1"/>
+        </w:rPr>
+      </w:pPr>
+      <w:r>
+        <w:rPr>
+          <w:color w:val="156082" w:themeColor="accent1"/>
+        </w:rPr>
+        <w:t xml:space="preserve">  "vigencia": "2027-01-01T06:00:00Z"</w:t>
+      </w:r>
+    </w:p>
+    <w:p>
+      <w:pPr>
+        <w:ind w:left="720"/>
+        <w:rPr>
+          <w:color w:val="156082" w:themeColor="accent1"/>
+        </w:rPr>
+      </w:pPr>
+      <w:r>
+        <w:rPr>
+          <w:color w:val="156082" w:themeColor="accent1"/>
+        </w:rPr>
         <w:t>}</w:t>
       </w:r>
     </w:p>
+    <w:p>
+      <w:pPr>
+        <w:numPr>
+          <w:ilvl w:val="0"/>
+          <w:numId w:val="43"/>
+        </w:numPr>
+      </w:pPr>
+      <w:r>
+        <w:t xml:space="preserve">Haz clic en </w:t>
+      </w:r>
+      <w:proofErr w:type="spellStart"/>
+      <w:r>
+        <w:rPr>
+          <w:b/>
+          <w:bCs/>
+        </w:rPr>
+        <w:t>Execute</w:t>
+      </w:r>
+      <w:proofErr w:type="spellEnd"/>
+      <w:r>
+        <w:t>.</w:t>
+      </w:r>
+    </w:p>
+    <w:p>
+      <w:pPr>
+        <w:numPr>
+          <w:ilvl w:val="0"/>
+          <w:numId w:val="43"/>
+        </w:numPr>
+      </w:pPr>
+      <w:r>
+        <w:t>Verifica que la respuesta confirme la actualización.</w:t>
+      </w:r>
+    </w:p>
+    <w:p/>
     <w:p>
       <w:bookmarkStart w:id="8" w:name="paso-4-productos"/>
       <w:bookmarkStart w:id="9" w:name="actualizar-put-2"/>
       <w:bookmarkEnd w:id="7"/>
       <w:r>
         <w:pict w14:anchorId="48D486B8">
-          <v:rect id="_x0000_i2176" style="width:0;height:1.5pt" o:hralign="center" o:hrstd="t" o:hr="t"/>
+          <v:rect id="_x0000_i1037" style="width:0;height:1.5pt" o:hralign="center" o:hrstd="t" o:hr="t"/>
         </w:pict>
       </w:r>
     </w:p>
@@ -8089,10 +9149,7 @@
       </w:r>
       <w:proofErr w:type="spellEnd"/>
       <w:r>
-        <w:t xml:space="preserve"> como herramienta de prueba rápida.</w:t>
-      </w:r>
-      <w:r>
-        <w:t xml:space="preserve"> </w:t>
+        <w:t xml:space="preserve"> como herramienta de prueba rápida. </w:t>
       </w:r>
     </w:p>
     <w:p>
@@ -9004,7 +10061,7 @@
     <w:p>
       <w:r>
         <w:pict w14:anchorId="14C40ADD">
-          <v:rect id="_x0000_i2179" style="width:0;height:1.5pt" o:hralign="center" o:hrstd="t" o:hr="t"/>
+          <v:rect id="_x0000_i1038" style="width:0;height:1.5pt" o:hralign="center" o:hrstd="t" o:hr="t"/>
         </w:pict>
       </w:r>
     </w:p>
@@ -9136,12 +10193,24 @@
         <w:rPr>
           <w:rStyle w:val="VerbatimChar"/>
         </w:rPr>
-        <w:t>ContraoCFE</w:t>
+        <w:t>Contra</w:t>
       </w:r>
       <w:r>
         <w:rPr>
           <w:rStyle w:val="VerbatimChar"/>
         </w:rPr>
+        <w:t>t</w:t>
+      </w:r>
+      <w:r>
+        <w:rPr>
+          <w:rStyle w:val="VerbatimChar"/>
+        </w:rPr>
+        <w:t>oCFE</w:t>
+      </w:r>
+      <w:r>
+        <w:rPr>
+          <w:rStyle w:val="VerbatimChar"/>
+        </w:rPr>
         <w:t>DTO</w:t>
       </w:r>
       <w:proofErr w:type="spellEnd"/>
@@ -9153,7 +10222,19 @@
         <w:rPr>
           <w:rStyle w:val="VerbatimChar"/>
         </w:rPr>
-        <w:t>ContratoCFEGarantia</w:t>
+        <w:t>ContratoCFE</w:t>
+      </w:r>
+      <w:r>
+        <w:rPr>
+          <w:rStyle w:val="VerbatimChar"/>
+        </w:rPr>
+        <w:t>Con</w:t>
+      </w:r>
+      <w:r>
+        <w:rPr>
+          <w:rStyle w:val="VerbatimChar"/>
+        </w:rPr>
+        <w:t>Garantia</w:t>
       </w:r>
       <w:r>
         <w:rPr>
@@ -9705,7 +10786,7 @@
 <w:numbering xmlns:wpc="http://schemas.microsoft.com/office/word/2010/wordprocessingCanvas" xmlns:cx="http://schemas.microsoft.com/office/drawing/2014/chartex" xmlns:cx1="http://schemas.microsoft.com/office/drawing/2015/9/8/chartex" xmlns:cx2="http://schemas.microsoft.com/office/drawing/2015/10/21/chartex" xmlns:cx3="http://schemas.microsoft.com/office/drawing/2016/5/9/chartex" xmlns:cx4="http://schemas.microsoft.com/office/drawing/2016/5/10/chartex" xmlns:cx5="http://schemas.microsoft.com/office/drawing/2016/5/11/chartex" xmlns:cx6="http://schemas.microsoft.com/office/drawing/2016/5/12/chartex" xmlns:cx7="http://schemas.microsoft.com/office/drawing/2016/5/13/chartex" xmlns:cx8="http://schemas.microsoft.com/office/drawing/2016/5/14/chartex" xmlns:mc="http://schemas.openxmlformats.org/markup-compatibility/2006" xmlns:aink="http://schemas.microsoft.com/office/drawing/2016/ink" xmlns:am3d="http://schemas.microsoft.com/office/drawing/2017/model3d" xmlns:o="urn:schemas-microsoft-com:office:office" xmlns:oel="http://schemas.microsoft.com/office/2019/extlst" xmlns:r="http://schemas.openxmlformats.org/officeDocument/2006/relationships" xmlns:m="http://schemas.openxmlformats.org/officeDocument/2006/math" xmlns:v="urn:schemas-microsoft-com:vml" xmlns:wp14="http://schemas.microsoft.com/office/word/2010/wordprocessingDrawing" xmlns:wp="http://schemas.openxmlformats.org/drawingml/2006/wordprocessingDrawing" xmlns:w10="urn:schemas-microsoft-com:office:word" xmlns:w="http://schemas.openxmlformats.org/wordprocessingml/2006/main" xmlns:w14="http://schemas.microsoft.com/office/word/2010/wordml" xmlns:w15="http://schemas.microsoft.com/office/word/2012/wordml" xmlns:w16cex="http://schemas.microsoft.com/office/word/2018/wordml/cex" xmlns:w16cid="http://schemas.microsoft.com/office/word/2016/wordml/cid" xmlns:w16="http://schemas.microsoft.com/office/word/2018/wordml" xmlns:w16du="http://schemas.microsoft.com/office/word/2023/wordml/word16du" xmlns:w16sdtdh="http://schemas.microsoft.com/office/word/2020/wordml/sdtdatahash" xmlns:w16sdtfl="http://schemas.microsoft.com/office/word/2024/wordml/sdtformatlock" xmlns:w16se="http://schemas.microsoft.com/office/word/2015/wordml/symex" xmlns:wpg="http://schemas.microsoft.com/office/word/2010/wordprocessingGroup" xmlns:wpi="http://schemas.microsoft.com/office/word/2010/wordprocessingInk" xmlns:wne="http://schemas.microsoft.com/office/word/2006/wordml" xmlns:wps="http://schemas.microsoft.com/office/word/2010/wordprocessingShape" mc:Ignorable="w14 w15 w16se w16cid w16 w16cex w16sdtdh w16sdtfl w16du wp14">
   <w:numPicBullet w:numPicBulletId="0">
     <w:pict>
-      <v:rect id="_x0000_i1215" style="width:0;height:1.5pt" o:hralign="center" o:bullet="t" o:hrstd="t" o:hr="t"/>
+      <v:rect id="_x0000_i1168" style="width:0;height:1.5pt" o:hralign="center" o:bullet="t" o:hrstd="t" o:hr="t"/>
     </w:pict>
   </w:numPicBullet>
   <w:abstractNum w:abstractNumId="0" w15:restartNumberingAfterBreak="0">
@@ -10125,6 +11206,119 @@
     </w:lvl>
   </w:abstractNum>
   <w:abstractNum w:abstractNumId="4" w15:restartNumberingAfterBreak="0">
+    <w:nsid w:val="086545CB"/>
+    <w:multiLevelType w:val="multilevel"/>
+    <w:tmpl w:val="9836BCC8"/>
+    <w:lvl w:ilvl="0">
+      <w:start w:val="5"/>
+      <w:numFmt w:val="decimal"/>
+      <w:lvlText w:val="%1."/>
+      <w:lvlJc w:val="left"/>
+      <w:pPr>
+        <w:tabs>
+          <w:tab w:val="num" w:pos="720"/>
+        </w:tabs>
+        <w:ind w:left="720" w:hanging="360"/>
+      </w:pPr>
+    </w:lvl>
+    <w:lvl w:ilvl="1" w:tentative="1">
+      <w:start w:val="1"/>
+      <w:numFmt w:val="decimal"/>
+      <w:lvlText w:val="%2."/>
+      <w:lvlJc w:val="left"/>
+      <w:pPr>
+        <w:tabs>
+          <w:tab w:val="num" w:pos="1440"/>
+        </w:tabs>
+        <w:ind w:left="1440" w:hanging="360"/>
+      </w:pPr>
+    </w:lvl>
+    <w:lvl w:ilvl="2" w:tentative="1">
+      <w:start w:val="1"/>
+      <w:numFmt w:val="decimal"/>
+      <w:lvlText w:val="%3."/>
+      <w:lvlJc w:val="left"/>
+      <w:pPr>
+        <w:tabs>
+          <w:tab w:val="num" w:pos="2160"/>
+        </w:tabs>
+        <w:ind w:left="2160" w:hanging="360"/>
+      </w:pPr>
+    </w:lvl>
+    <w:lvl w:ilvl="3" w:tentative="1">
+      <w:start w:val="1"/>
+      <w:numFmt w:val="decimal"/>
+      <w:lvlText w:val="%4."/>
+      <w:lvlJc w:val="left"/>
+      <w:pPr>
+        <w:tabs>
+          <w:tab w:val="num" w:pos="2880"/>
+        </w:tabs>
+        <w:ind w:left="2880" w:hanging="360"/>
+      </w:pPr>
+    </w:lvl>
+    <w:lvl w:ilvl="4" w:tentative="1">
+      <w:start w:val="1"/>
+      <w:numFmt w:val="decimal"/>
+      <w:lvlText w:val="%5."/>
+      <w:lvlJc w:val="left"/>
+      <w:pPr>
+        <w:tabs>
+          <w:tab w:val="num" w:pos="3600"/>
+        </w:tabs>
+        <w:ind w:left="3600" w:hanging="360"/>
+      </w:pPr>
+    </w:lvl>
+    <w:lvl w:ilvl="5" w:tentative="1">
+      <w:start w:val="1"/>
+      <w:numFmt w:val="decimal"/>
+      <w:lvlText w:val="%6."/>
+      <w:lvlJc w:val="left"/>
+      <w:pPr>
+        <w:tabs>
+          <w:tab w:val="num" w:pos="4320"/>
+        </w:tabs>
+        <w:ind w:left="4320" w:hanging="360"/>
+      </w:pPr>
+    </w:lvl>
+    <w:lvl w:ilvl="6" w:tentative="1">
+      <w:start w:val="1"/>
+      <w:numFmt w:val="decimal"/>
+      <w:lvlText w:val="%7."/>
+      <w:lvlJc w:val="left"/>
+      <w:pPr>
+        <w:tabs>
+          <w:tab w:val="num" w:pos="5040"/>
+        </w:tabs>
+        <w:ind w:left="5040" w:hanging="360"/>
+      </w:pPr>
+    </w:lvl>
+    <w:lvl w:ilvl="7" w:tentative="1">
+      <w:start w:val="1"/>
+      <w:numFmt w:val="decimal"/>
+      <w:lvlText w:val="%8."/>
+      <w:lvlJc w:val="left"/>
+      <w:pPr>
+        <w:tabs>
+          <w:tab w:val="num" w:pos="5760"/>
+        </w:tabs>
+        <w:ind w:left="5760" w:hanging="360"/>
+      </w:pPr>
+    </w:lvl>
+    <w:lvl w:ilvl="8" w:tentative="1">
+      <w:start w:val="1"/>
+      <w:numFmt w:val="decimal"/>
+      <w:lvlText w:val="%9."/>
+      <w:lvlJc w:val="left"/>
+      <w:pPr>
+        <w:tabs>
+          <w:tab w:val="num" w:pos="6480"/>
+        </w:tabs>
+        <w:ind w:left="6480" w:hanging="360"/>
+      </w:pPr>
+    </w:lvl>
+  </w:abstractNum>
+  <w:abstractNum w:abstractNumId="5" w15:restartNumberingAfterBreak="0">
     <w:nsid w:val="16E9131D"/>
     <w:multiLevelType w:val="multilevel"/>
     <w:tmpl w:val="F88E0FEE"/>
@@ -10273,7 +11467,156 @@
       </w:rPr>
     </w:lvl>
   </w:abstractNum>
-  <w:abstractNum w:abstractNumId="5" w15:restartNumberingAfterBreak="0">
+  <w:abstractNum w:abstractNumId="6" w15:restartNumberingAfterBreak="0">
+    <w:nsid w:val="1B6D6131"/>
+    <w:multiLevelType w:val="multilevel"/>
+    <w:tmpl w:val="D1E6FB78"/>
+    <w:lvl w:ilvl="0">
+      <w:start w:val="1"/>
+      <w:numFmt w:val="bullet"/>
+      <w:lvlText w:val=""/>
+      <w:lvlJc w:val="left"/>
+      <w:pPr>
+        <w:tabs>
+          <w:tab w:val="num" w:pos="720"/>
+        </w:tabs>
+        <w:ind w:left="720" w:hanging="360"/>
+      </w:pPr>
+      <w:rPr>
+        <w:rFonts w:ascii="Symbol" w:hAnsi="Symbol" w:hint="default"/>
+        <w:sz w:val="20"/>
+      </w:rPr>
+    </w:lvl>
+    <w:lvl w:ilvl="1" w:tentative="1">
+      <w:start w:val="1"/>
+      <w:numFmt w:val="bullet"/>
+      <w:lvlText w:val="o"/>
+      <w:lvlJc w:val="left"/>
+      <w:pPr>
+        <w:tabs>
+          <w:tab w:val="num" w:pos="1440"/>
+        </w:tabs>
+        <w:ind w:left="1440" w:hanging="360"/>
+      </w:pPr>
+      <w:rPr>
+        <w:rFonts w:ascii="Courier New" w:hAnsi="Courier New" w:hint="default"/>
+        <w:sz w:val="20"/>
+      </w:rPr>
+    </w:lvl>
+    <w:lvl w:ilvl="2" w:tentative="1">
+      <w:start w:val="1"/>
+      <w:numFmt w:val="bullet"/>
+      <w:lvlText w:val=""/>
+      <w:lvlJc w:val="left"/>
+      <w:pPr>
+        <w:tabs>
+          <w:tab w:val="num" w:pos="2160"/>
+        </w:tabs>
+        <w:ind w:left="2160" w:hanging="360"/>
+      </w:pPr>
+      <w:rPr>
+        <w:rFonts w:ascii="Wingdings" w:hAnsi="Wingdings" w:hint="default"/>
+        <w:sz w:val="20"/>
+      </w:rPr>
+    </w:lvl>
+    <w:lvl w:ilvl="3" w:tentative="1">
+      <w:start w:val="1"/>
+      <w:numFmt w:val="bullet"/>
+      <w:lvlText w:val=""/>
+      <w:lvlJc w:val="left"/>
+      <w:pPr>
+        <w:tabs>
+          <w:tab w:val="num" w:pos="2880"/>
+        </w:tabs>
+        <w:ind w:left="2880" w:hanging="360"/>
+      </w:pPr>
+      <w:rPr>
+        <w:rFonts w:ascii="Wingdings" w:hAnsi="Wingdings" w:hint="default"/>
+        <w:sz w:val="20"/>
+      </w:rPr>
+    </w:lvl>
+    <w:lvl w:ilvl="4" w:tentative="1">
+      <w:start w:val="1"/>
+      <w:numFmt w:val="bullet"/>
+      <w:lvlText w:val=""/>
+      <w:lvlJc w:val="left"/>
+      <w:pPr>
+        <w:tabs>
+          <w:tab w:val="num" w:pos="3600"/>
+        </w:tabs>
+        <w:ind w:left="3600" w:hanging="360"/>
+      </w:pPr>
+      <w:rPr>
+        <w:rFonts w:ascii="Wingdings" w:hAnsi="Wingdings" w:hint="default"/>
+        <w:sz w:val="20"/>
+      </w:rPr>
+    </w:lvl>
+    <w:lvl w:ilvl="5" w:tentative="1">
+      <w:start w:val="1"/>
+      <w:numFmt w:val="bullet"/>
+      <w:lvlText w:val=""/>
+      <w:lvlJc w:val="left"/>
+      <w:pPr>
+        <w:tabs>
+          <w:tab w:val="num" w:pos="4320"/>
+        </w:tabs>
+        <w:ind w:left="4320" w:hanging="360"/>
+      </w:pPr>
+      <w:rPr>
+        <w:rFonts w:ascii="Wingdings" w:hAnsi="Wingdings" w:hint="default"/>
+        <w:sz w:val="20"/>
+      </w:rPr>
+    </w:lvl>
+    <w:lvl w:ilvl="6" w:tentative="1">
+      <w:start w:val="1"/>
+      <w:numFmt w:val="bullet"/>
+      <w:lvlText w:val=""/>
+      <w:lvlJc w:val="left"/>
+      <w:pPr>
+        <w:tabs>
+          <w:tab w:val="num" w:pos="5040"/>
+        </w:tabs>
+        <w:ind w:left="5040" w:hanging="360"/>
+      </w:pPr>
+      <w:rPr>
+        <w:rFonts w:ascii="Wingdings" w:hAnsi="Wingdings" w:hint="default"/>
+        <w:sz w:val="20"/>
+      </w:rPr>
+    </w:lvl>
+    <w:lvl w:ilvl="7" w:tentative="1">
+      <w:start w:val="1"/>
+      <w:numFmt w:val="bullet"/>
+      <w:lvlText w:val=""/>
+      <w:lvlJc w:val="left"/>
+      <w:pPr>
+        <w:tabs>
+          <w:tab w:val="num" w:pos="5760"/>
+        </w:tabs>
+        <w:ind w:left="5760" w:hanging="360"/>
+      </w:pPr>
+      <w:rPr>
+        <w:rFonts w:ascii="Wingdings" w:hAnsi="Wingdings" w:hint="default"/>
+        <w:sz w:val="20"/>
+      </w:rPr>
+    </w:lvl>
+    <w:lvl w:ilvl="8" w:tentative="1">
+      <w:start w:val="1"/>
+      <w:numFmt w:val="bullet"/>
+      <w:lvlText w:val=""/>
+      <w:lvlJc w:val="left"/>
+      <w:pPr>
+        <w:tabs>
+          <w:tab w:val="num" w:pos="6480"/>
+        </w:tabs>
+        <w:ind w:left="6480" w:hanging="360"/>
+      </w:pPr>
+      <w:rPr>
+        <w:rFonts w:ascii="Wingdings" w:hAnsi="Wingdings" w:hint="default"/>
+        <w:sz w:val="20"/>
+      </w:rPr>
+    </w:lvl>
+  </w:abstractNum>
+  <w:abstractNum w:abstractNumId="7" w15:restartNumberingAfterBreak="0">
     <w:nsid w:val="1CE951DC"/>
     <w:multiLevelType w:val="multilevel"/>
     <w:tmpl w:val="3A065B3A"/>
@@ -10422,7 +11765,7 @@
       </w:rPr>
     </w:lvl>
   </w:abstractNum>
-  <w:abstractNum w:abstractNumId="6" w15:restartNumberingAfterBreak="0">
+  <w:abstractNum w:abstractNumId="8" w15:restartNumberingAfterBreak="0">
     <w:nsid w:val="22607BDF"/>
     <w:multiLevelType w:val="multilevel"/>
     <w:tmpl w:val="F604A0CC"/>
@@ -10535,7 +11878,7 @@
       </w:pPr>
     </w:lvl>
   </w:abstractNum>
-  <w:abstractNum w:abstractNumId="7" w15:restartNumberingAfterBreak="0">
+  <w:abstractNum w:abstractNumId="9" w15:restartNumberingAfterBreak="0">
     <w:nsid w:val="26C51893"/>
     <w:multiLevelType w:val="multilevel"/>
     <w:tmpl w:val="D17E5F54"/>
@@ -10652,7 +11995,7 @@
       </w:pPr>
     </w:lvl>
   </w:abstractNum>
-  <w:abstractNum w:abstractNumId="8" w15:restartNumberingAfterBreak="0">
+  <w:abstractNum w:abstractNumId="10" w15:restartNumberingAfterBreak="0">
     <w:nsid w:val="382F1E9A"/>
     <w:multiLevelType w:val="hybridMultilevel"/>
     <w:tmpl w:val="580E792C"/>
@@ -10765,7 +12108,7 @@
       </w:rPr>
     </w:lvl>
   </w:abstractNum>
-  <w:abstractNum w:abstractNumId="9" w15:restartNumberingAfterBreak="0">
+  <w:abstractNum w:abstractNumId="11" w15:restartNumberingAfterBreak="0">
     <w:nsid w:val="3956558D"/>
     <w:multiLevelType w:val="multilevel"/>
     <w:tmpl w:val="F604A0CC"/>
@@ -10878,7 +12221,7 @@
       </w:pPr>
     </w:lvl>
   </w:abstractNum>
-  <w:abstractNum w:abstractNumId="10" w15:restartNumberingAfterBreak="0">
+  <w:abstractNum w:abstractNumId="12" w15:restartNumberingAfterBreak="0">
     <w:nsid w:val="3FBC5942"/>
     <w:multiLevelType w:val="multilevel"/>
     <w:tmpl w:val="F63E3E9C"/>
@@ -11027,7 +12370,120 @@
       </w:rPr>
     </w:lvl>
   </w:abstractNum>
-  <w:abstractNum w:abstractNumId="11" w15:restartNumberingAfterBreak="0">
+  <w:abstractNum w:abstractNumId="13" w15:restartNumberingAfterBreak="0">
+    <w:nsid w:val="4067037C"/>
+    <w:multiLevelType w:val="multilevel"/>
+    <w:tmpl w:val="D5F6BE28"/>
+    <w:lvl w:ilvl="0">
+      <w:start w:val="1"/>
+      <w:numFmt w:val="decimal"/>
+      <w:lvlText w:val="%1."/>
+      <w:lvlJc w:val="left"/>
+      <w:pPr>
+        <w:tabs>
+          <w:tab w:val="num" w:pos="720"/>
+        </w:tabs>
+        <w:ind w:left="720" w:hanging="360"/>
+      </w:pPr>
+    </w:lvl>
+    <w:lvl w:ilvl="1" w:tentative="1">
+      <w:start w:val="1"/>
+      <w:numFmt w:val="decimal"/>
+      <w:lvlText w:val="%2."/>
+      <w:lvlJc w:val="left"/>
+      <w:pPr>
+        <w:tabs>
+          <w:tab w:val="num" w:pos="1440"/>
+        </w:tabs>
+        <w:ind w:left="1440" w:hanging="360"/>
+      </w:pPr>
+    </w:lvl>
+    <w:lvl w:ilvl="2" w:tentative="1">
+      <w:start w:val="1"/>
+      <w:numFmt w:val="decimal"/>
+      <w:lvlText w:val="%3."/>
+      <w:lvlJc w:val="left"/>
+      <w:pPr>
+        <w:tabs>
+          <w:tab w:val="num" w:pos="2160"/>
+        </w:tabs>
+        <w:ind w:left="2160" w:hanging="360"/>
+      </w:pPr>
+    </w:lvl>
+    <w:lvl w:ilvl="3" w:tentative="1">
+      <w:start w:val="1"/>
+      <w:numFmt w:val="decimal"/>
+      <w:lvlText w:val="%4."/>
+      <w:lvlJc w:val="left"/>
+      <w:pPr>
+        <w:tabs>
+          <w:tab w:val="num" w:pos="2880"/>
+        </w:tabs>
+        <w:ind w:left="2880" w:hanging="360"/>
+      </w:pPr>
+    </w:lvl>
+    <w:lvl w:ilvl="4" w:tentative="1">
+      <w:start w:val="1"/>
+      <w:numFmt w:val="decimal"/>
+      <w:lvlText w:val="%5."/>
+      <w:lvlJc w:val="left"/>
+      <w:pPr>
+        <w:tabs>
+          <w:tab w:val="num" w:pos="3600"/>
+        </w:tabs>
+        <w:ind w:left="3600" w:hanging="360"/>
+      </w:pPr>
+    </w:lvl>
+    <w:lvl w:ilvl="5" w:tentative="1">
+      <w:start w:val="1"/>
+      <w:numFmt w:val="decimal"/>
+      <w:lvlText w:val="%6."/>
+      <w:lvlJc w:val="left"/>
+      <w:pPr>
+        <w:tabs>
+          <w:tab w:val="num" w:pos="4320"/>
+        </w:tabs>
+        <w:ind w:left="4320" w:hanging="360"/>
+      </w:pPr>
+    </w:lvl>
+    <w:lvl w:ilvl="6" w:tentative="1">
+      <w:start w:val="1"/>
+      <w:numFmt w:val="decimal"/>
+      <w:lvlText w:val="%7."/>
+      <w:lvlJc w:val="left"/>
+      <w:pPr>
+        <w:tabs>
+          <w:tab w:val="num" w:pos="5040"/>
+        </w:tabs>
+        <w:ind w:left="5040" w:hanging="360"/>
+      </w:pPr>
+    </w:lvl>
+    <w:lvl w:ilvl="7" w:tentative="1">
+      <w:start w:val="1"/>
+      <w:numFmt w:val="decimal"/>
+      <w:lvlText w:val="%8."/>
+      <w:lvlJc w:val="left"/>
+      <w:pPr>
+        <w:tabs>
+          <w:tab w:val="num" w:pos="5760"/>
+        </w:tabs>
+        <w:ind w:left="5760" w:hanging="360"/>
+      </w:pPr>
+    </w:lvl>
+    <w:lvl w:ilvl="8" w:tentative="1">
+      <w:start w:val="1"/>
+      <w:numFmt w:val="decimal"/>
+      <w:lvlText w:val="%9."/>
+      <w:lvlJc w:val="left"/>
+      <w:pPr>
+        <w:tabs>
+          <w:tab w:val="num" w:pos="6480"/>
+        </w:tabs>
+        <w:ind w:left="6480" w:hanging="360"/>
+      </w:pPr>
+    </w:lvl>
+  </w:abstractNum>
+  <w:abstractNum w:abstractNumId="14" w15:restartNumberingAfterBreak="0">
     <w:nsid w:val="416F053E"/>
     <w:multiLevelType w:val="multilevel"/>
     <w:tmpl w:val="9086CA4C"/>
@@ -11176,7 +12632,7 @@
       </w:rPr>
     </w:lvl>
   </w:abstractNum>
-  <w:abstractNum w:abstractNumId="12" w15:restartNumberingAfterBreak="0">
+  <w:abstractNum w:abstractNumId="15" w15:restartNumberingAfterBreak="0">
     <w:nsid w:val="440F2C53"/>
     <w:multiLevelType w:val="hybridMultilevel"/>
     <w:tmpl w:val="6DD28054"/>
@@ -11289,7 +12745,265 @@
       </w:rPr>
     </w:lvl>
   </w:abstractNum>
-  <w:abstractNum w:abstractNumId="13" w15:restartNumberingAfterBreak="0">
+  <w:abstractNum w:abstractNumId="16" w15:restartNumberingAfterBreak="0">
+    <w:nsid w:val="46A5651C"/>
+    <w:multiLevelType w:val="multilevel"/>
+    <w:tmpl w:val="4790D514"/>
+    <w:lvl w:ilvl="0">
+      <w:start w:val="1"/>
+      <w:numFmt w:val="bullet"/>
+      <w:lvlText w:val=""/>
+      <w:lvlJc w:val="left"/>
+      <w:pPr>
+        <w:tabs>
+          <w:tab w:val="num" w:pos="720"/>
+        </w:tabs>
+        <w:ind w:left="720" w:hanging="360"/>
+      </w:pPr>
+      <w:rPr>
+        <w:rFonts w:ascii="Symbol" w:hAnsi="Symbol" w:hint="default"/>
+        <w:sz w:val="20"/>
+      </w:rPr>
+    </w:lvl>
+    <w:lvl w:ilvl="1">
+      <w:start w:val="1"/>
+      <w:numFmt w:val="decimal"/>
+      <w:lvlText w:val="%2."/>
+      <w:lvlJc w:val="left"/>
+      <w:pPr>
+        <w:tabs>
+          <w:tab w:val="num" w:pos="1440"/>
+        </w:tabs>
+        <w:ind w:left="1440" w:hanging="360"/>
+      </w:pPr>
+    </w:lvl>
+    <w:lvl w:ilvl="2">
+      <w:start w:val="1"/>
+      <w:numFmt w:val="bullet"/>
+      <w:lvlText w:val=""/>
+      <w:lvlJc w:val="left"/>
+      <w:pPr>
+        <w:tabs>
+          <w:tab w:val="num" w:pos="2160"/>
+        </w:tabs>
+        <w:ind w:left="2160" w:hanging="360"/>
+      </w:pPr>
+      <w:rPr>
+        <w:rFonts w:ascii="Wingdings" w:hAnsi="Wingdings" w:hint="default"/>
+        <w:sz w:val="20"/>
+      </w:rPr>
+    </w:lvl>
+    <w:lvl w:ilvl="3" w:tentative="1">
+      <w:start w:val="1"/>
+      <w:numFmt w:val="bullet"/>
+      <w:lvlText w:val=""/>
+      <w:lvlJc w:val="left"/>
+      <w:pPr>
+        <w:tabs>
+          <w:tab w:val="num" w:pos="2880"/>
+        </w:tabs>
+        <w:ind w:left="2880" w:hanging="360"/>
+      </w:pPr>
+      <w:rPr>
+        <w:rFonts w:ascii="Wingdings" w:hAnsi="Wingdings" w:hint="default"/>
+        <w:sz w:val="20"/>
+      </w:rPr>
+    </w:lvl>
+    <w:lvl w:ilvl="4" w:tentative="1">
+      <w:start w:val="1"/>
+      <w:numFmt w:val="bullet"/>
+      <w:lvlText w:val=""/>
+      <w:lvlJc w:val="left"/>
+      <w:pPr>
+        <w:tabs>
+          <w:tab w:val="num" w:pos="3600"/>
+        </w:tabs>
+        <w:ind w:left="3600" w:hanging="360"/>
+      </w:pPr>
+      <w:rPr>
+        <w:rFonts w:ascii="Wingdings" w:hAnsi="Wingdings" w:hint="default"/>
+        <w:sz w:val="20"/>
+      </w:rPr>
+    </w:lvl>
+    <w:lvl w:ilvl="5" w:tentative="1">
+      <w:start w:val="1"/>
+      <w:numFmt w:val="bullet"/>
+      <w:lvlText w:val=""/>
+      <w:lvlJc w:val="left"/>
+      <w:pPr>
+        <w:tabs>
+          <w:tab w:val="num" w:pos="4320"/>
+        </w:tabs>
+        <w:ind w:left="4320" w:hanging="360"/>
+      </w:pPr>
+      <w:rPr>
+        <w:rFonts w:ascii="Wingdings" w:hAnsi="Wingdings" w:hint="default"/>
+        <w:sz w:val="20"/>
+      </w:rPr>
+    </w:lvl>
+    <w:lvl w:ilvl="6" w:tentative="1">
+      <w:start w:val="1"/>
+      <w:numFmt w:val="bullet"/>
+      <w:lvlText w:val=""/>
+      <w:lvlJc w:val="left"/>
+      <w:pPr>
+        <w:tabs>
+          <w:tab w:val="num" w:pos="5040"/>
+        </w:tabs>
+        <w:ind w:left="5040" w:hanging="360"/>
+      </w:pPr>
+      <w:rPr>
+        <w:rFonts w:ascii="Wingdings" w:hAnsi="Wingdings" w:hint="default"/>
+        <w:sz w:val="20"/>
+      </w:rPr>
+    </w:lvl>
+    <w:lvl w:ilvl="7" w:tentative="1">
+      <w:start w:val="1"/>
+      <w:numFmt w:val="bullet"/>
+      <w:lvlText w:val=""/>
+      <w:lvlJc w:val="left"/>
+      <w:pPr>
+        <w:tabs>
+          <w:tab w:val="num" w:pos="5760"/>
+        </w:tabs>
+        <w:ind w:left="5760" w:hanging="360"/>
+      </w:pPr>
+      <w:rPr>
+        <w:rFonts w:ascii="Wingdings" w:hAnsi="Wingdings" w:hint="default"/>
+        <w:sz w:val="20"/>
+      </w:rPr>
+    </w:lvl>
+    <w:lvl w:ilvl="8" w:tentative="1">
+      <w:start w:val="1"/>
+      <w:numFmt w:val="bullet"/>
+      <w:lvlText w:val=""/>
+      <w:lvlJc w:val="left"/>
+      <w:pPr>
+        <w:tabs>
+          <w:tab w:val="num" w:pos="6480"/>
+        </w:tabs>
+        <w:ind w:left="6480" w:hanging="360"/>
+      </w:pPr>
+      <w:rPr>
+        <w:rFonts w:ascii="Wingdings" w:hAnsi="Wingdings" w:hint="default"/>
+        <w:sz w:val="20"/>
+      </w:rPr>
+    </w:lvl>
+  </w:abstractNum>
+  <w:abstractNum w:abstractNumId="17" w15:restartNumberingAfterBreak="0">
+    <w:nsid w:val="47735041"/>
+    <w:multiLevelType w:val="multilevel"/>
+    <w:tmpl w:val="192C330C"/>
+    <w:lvl w:ilvl="0">
+      <w:start w:val="1"/>
+      <w:numFmt w:val="decimal"/>
+      <w:lvlText w:val="%1."/>
+      <w:lvlJc w:val="left"/>
+      <w:pPr>
+        <w:tabs>
+          <w:tab w:val="num" w:pos="720"/>
+        </w:tabs>
+        <w:ind w:left="720" w:hanging="360"/>
+      </w:pPr>
+    </w:lvl>
+    <w:lvl w:ilvl="1" w:tentative="1">
+      <w:start w:val="1"/>
+      <w:numFmt w:val="decimal"/>
+      <w:lvlText w:val="%2."/>
+      <w:lvlJc w:val="left"/>
+      <w:pPr>
+        <w:tabs>
+          <w:tab w:val="num" w:pos="1440"/>
+        </w:tabs>
+        <w:ind w:left="1440" w:hanging="360"/>
+      </w:pPr>
+    </w:lvl>
+    <w:lvl w:ilvl="2" w:tentative="1">
+      <w:start w:val="1"/>
+      <w:numFmt w:val="decimal"/>
+      <w:lvlText w:val="%3."/>
+      <w:lvlJc w:val="left"/>
+      <w:pPr>
+        <w:tabs>
+          <w:tab w:val="num" w:pos="2160"/>
+        </w:tabs>
+        <w:ind w:left="2160" w:hanging="360"/>
+      </w:pPr>
+    </w:lvl>
+    <w:lvl w:ilvl="3" w:tentative="1">
+      <w:start w:val="1"/>
+      <w:numFmt w:val="decimal"/>
+      <w:lvlText w:val="%4."/>
+      <w:lvlJc w:val="left"/>
+      <w:pPr>
+        <w:tabs>
+          <w:tab w:val="num" w:pos="2880"/>
+        </w:tabs>
+        <w:ind w:left="2880" w:hanging="360"/>
+      </w:pPr>
+    </w:lvl>
+    <w:lvl w:ilvl="4" w:tentative="1">
+      <w:start w:val="1"/>
+      <w:numFmt w:val="decimal"/>
+      <w:lvlText w:val="%5."/>
+      <w:lvlJc w:val="left"/>
+      <w:pPr>
+        <w:tabs>
+          <w:tab w:val="num" w:pos="3600"/>
+        </w:tabs>
+        <w:ind w:left="3600" w:hanging="360"/>
+      </w:pPr>
+    </w:lvl>
+    <w:lvl w:ilvl="5" w:tentative="1">
+      <w:start w:val="1"/>
+      <w:numFmt w:val="decimal"/>
+      <w:lvlText w:val="%6."/>
+      <w:lvlJc w:val="left"/>
+      <w:pPr>
+        <w:tabs>
+          <w:tab w:val="num" w:pos="4320"/>
+        </w:tabs>
+        <w:ind w:left="4320" w:hanging="360"/>
+      </w:pPr>
+    </w:lvl>
+    <w:lvl w:ilvl="6" w:tentative="1">
+      <w:start w:val="1"/>
+      <w:numFmt w:val="decimal"/>
+      <w:lvlText w:val="%7."/>
+      <w:lvlJc w:val="left"/>
+      <w:pPr>
+        <w:tabs>
+          <w:tab w:val="num" w:pos="5040"/>
+        </w:tabs>
+        <w:ind w:left="5040" w:hanging="360"/>
+      </w:pPr>
+    </w:lvl>
+    <w:lvl w:ilvl="7" w:tentative="1">
+      <w:start w:val="1"/>
+      <w:numFmt w:val="decimal"/>
+      <w:lvlText w:val="%8."/>
+      <w:lvlJc w:val="left"/>
+      <w:pPr>
+        <w:tabs>
+          <w:tab w:val="num" w:pos="5760"/>
+        </w:tabs>
+        <w:ind w:left="5760" w:hanging="360"/>
+      </w:pPr>
+    </w:lvl>
+    <w:lvl w:ilvl="8" w:tentative="1">
+      <w:start w:val="1"/>
+      <w:numFmt w:val="decimal"/>
+      <w:lvlText w:val="%9."/>
+      <w:lvlJc w:val="left"/>
+      <w:pPr>
+        <w:tabs>
+          <w:tab w:val="num" w:pos="6480"/>
+        </w:tabs>
+        <w:ind w:left="6480" w:hanging="360"/>
+      </w:pPr>
+    </w:lvl>
+  </w:abstractNum>
+  <w:abstractNum w:abstractNumId="18" w15:restartNumberingAfterBreak="0">
     <w:nsid w:val="4D697695"/>
     <w:multiLevelType w:val="hybridMultilevel"/>
     <w:tmpl w:val="E8F82D90"/>
@@ -11402,7 +13116,7 @@
       </w:rPr>
     </w:lvl>
   </w:abstractNum>
-  <w:abstractNum w:abstractNumId="14" w15:restartNumberingAfterBreak="0">
+  <w:abstractNum w:abstractNumId="19" w15:restartNumberingAfterBreak="0">
     <w:nsid w:val="5F5F7FDF"/>
     <w:multiLevelType w:val="multilevel"/>
     <w:tmpl w:val="DCB00968"/>
@@ -11515,7 +13229,7 @@
       </w:pPr>
     </w:lvl>
   </w:abstractNum>
-  <w:abstractNum w:abstractNumId="15" w15:restartNumberingAfterBreak="0">
+  <w:abstractNum w:abstractNumId="20" w15:restartNumberingAfterBreak="0">
     <w:nsid w:val="624E043C"/>
     <w:multiLevelType w:val="multilevel"/>
     <w:tmpl w:val="F604A0CC"/>
@@ -11628,7 +13342,7 @@
       </w:pPr>
     </w:lvl>
   </w:abstractNum>
-  <w:abstractNum w:abstractNumId="16" w15:restartNumberingAfterBreak="0">
+  <w:abstractNum w:abstractNumId="21" w15:restartNumberingAfterBreak="0">
     <w:nsid w:val="67D75F7C"/>
     <w:multiLevelType w:val="hybridMultilevel"/>
     <w:tmpl w:val="C5A2582C"/>
@@ -11740,7 +13454,120 @@
       </w:rPr>
     </w:lvl>
   </w:abstractNum>
-  <w:abstractNum w:abstractNumId="17" w15:restartNumberingAfterBreak="0">
+  <w:abstractNum w:abstractNumId="22" w15:restartNumberingAfterBreak="0">
+    <w:nsid w:val="69ED050D"/>
+    <w:multiLevelType w:val="multilevel"/>
+    <w:tmpl w:val="DA3010EE"/>
+    <w:lvl w:ilvl="0">
+      <w:start w:val="1"/>
+      <w:numFmt w:val="decimal"/>
+      <w:lvlText w:val="%1."/>
+      <w:lvlJc w:val="left"/>
+      <w:pPr>
+        <w:tabs>
+          <w:tab w:val="num" w:pos="720"/>
+        </w:tabs>
+        <w:ind w:left="720" w:hanging="360"/>
+      </w:pPr>
+    </w:lvl>
+    <w:lvl w:ilvl="1" w:tentative="1">
+      <w:start w:val="1"/>
+      <w:numFmt w:val="decimal"/>
+      <w:lvlText w:val="%2."/>
+      <w:lvlJc w:val="left"/>
+      <w:pPr>
+        <w:tabs>
+          <w:tab w:val="num" w:pos="1440"/>
+        </w:tabs>
+        <w:ind w:left="1440" w:hanging="360"/>
+      </w:pPr>
+    </w:lvl>
+    <w:lvl w:ilvl="2" w:tentative="1">
+      <w:start w:val="1"/>
+      <w:numFmt w:val="decimal"/>
+      <w:lvlText w:val="%3."/>
+      <w:lvlJc w:val="left"/>
+      <w:pPr>
+        <w:tabs>
+          <w:tab w:val="num" w:pos="2160"/>
+        </w:tabs>
+        <w:ind w:left="2160" w:hanging="360"/>
+      </w:pPr>
+    </w:lvl>
+    <w:lvl w:ilvl="3" w:tentative="1">
+      <w:start w:val="1"/>
+      <w:numFmt w:val="decimal"/>
+      <w:lvlText w:val="%4."/>
+      <w:lvlJc w:val="left"/>
+      <w:pPr>
+        <w:tabs>
+          <w:tab w:val="num" w:pos="2880"/>
+        </w:tabs>
+        <w:ind w:left="2880" w:hanging="360"/>
+      </w:pPr>
+    </w:lvl>
+    <w:lvl w:ilvl="4" w:tentative="1">
+      <w:start w:val="1"/>
+      <w:numFmt w:val="decimal"/>
+      <w:lvlText w:val="%5."/>
+      <w:lvlJc w:val="left"/>
+      <w:pPr>
+        <w:tabs>
+          <w:tab w:val="num" w:pos="3600"/>
+        </w:tabs>
+        <w:ind w:left="3600" w:hanging="360"/>
+      </w:pPr>
+    </w:lvl>
+    <w:lvl w:ilvl="5" w:tentative="1">
+      <w:start w:val="1"/>
+      <w:numFmt w:val="decimal"/>
+      <w:lvlText w:val="%6."/>
+      <w:lvlJc w:val="left"/>
+      <w:pPr>
+        <w:tabs>
+          <w:tab w:val="num" w:pos="4320"/>
+        </w:tabs>
+        <w:ind w:left="4320" w:hanging="360"/>
+      </w:pPr>
+    </w:lvl>
+    <w:lvl w:ilvl="6" w:tentative="1">
+      <w:start w:val="1"/>
+      <w:numFmt w:val="decimal"/>
+      <w:lvlText w:val="%7."/>
+      <w:lvlJc w:val="left"/>
+      <w:pPr>
+        <w:tabs>
+          <w:tab w:val="num" w:pos="5040"/>
+        </w:tabs>
+        <w:ind w:left="5040" w:hanging="360"/>
+      </w:pPr>
+    </w:lvl>
+    <w:lvl w:ilvl="7" w:tentative="1">
+      <w:start w:val="1"/>
+      <w:numFmt w:val="decimal"/>
+      <w:lvlText w:val="%8."/>
+      <w:lvlJc w:val="left"/>
+      <w:pPr>
+        <w:tabs>
+          <w:tab w:val="num" w:pos="5760"/>
+        </w:tabs>
+        <w:ind w:left="5760" w:hanging="360"/>
+      </w:pPr>
+    </w:lvl>
+    <w:lvl w:ilvl="8" w:tentative="1">
+      <w:start w:val="1"/>
+      <w:numFmt w:val="decimal"/>
+      <w:lvlText w:val="%9."/>
+      <w:lvlJc w:val="left"/>
+      <w:pPr>
+        <w:tabs>
+          <w:tab w:val="num" w:pos="6480"/>
+        </w:tabs>
+        <w:ind w:left="6480" w:hanging="360"/>
+      </w:pPr>
+    </w:lvl>
+  </w:abstractNum>
+  <w:abstractNum w:abstractNumId="23" w15:restartNumberingAfterBreak="0">
     <w:nsid w:val="6D3301BE"/>
     <w:multiLevelType w:val="multilevel"/>
     <w:tmpl w:val="F604A0CC"/>
@@ -11853,7 +13680,7 @@
       </w:pPr>
     </w:lvl>
   </w:abstractNum>
-  <w:abstractNum w:abstractNumId="18" w15:restartNumberingAfterBreak="0">
+  <w:abstractNum w:abstractNumId="24" w15:restartNumberingAfterBreak="0">
     <w:nsid w:val="6FF130A6"/>
     <w:multiLevelType w:val="multilevel"/>
     <w:tmpl w:val="20D039D0"/>
@@ -11885,7 +13712,7 @@
         <w:sz w:val="20"/>
       </w:rPr>
     </w:lvl>
-    <w:lvl w:ilvl="2" w:tentative="1">
+    <w:lvl w:ilvl="2">
       <w:start w:val="1"/>
       <w:numFmt w:val="decimal"/>
       <w:lvlText w:val="%3."/>
@@ -11970,7 +13797,495 @@
       </w:pPr>
     </w:lvl>
   </w:abstractNum>
-  <w:abstractNum w:abstractNumId="19" w15:restartNumberingAfterBreak="0">
+  <w:abstractNum w:abstractNumId="25" w15:restartNumberingAfterBreak="0">
+    <w:nsid w:val="72E03CB5"/>
+    <w:multiLevelType w:val="multilevel"/>
+    <w:tmpl w:val="39501206"/>
+    <w:lvl w:ilvl="0">
+      <w:start w:val="4"/>
+      <w:numFmt w:val="decimal"/>
+      <w:lvlText w:val="%1."/>
+      <w:lvlJc w:val="left"/>
+      <w:pPr>
+        <w:tabs>
+          <w:tab w:val="num" w:pos="720"/>
+        </w:tabs>
+        <w:ind w:left="720" w:hanging="360"/>
+      </w:pPr>
+    </w:lvl>
+    <w:lvl w:ilvl="1" w:tentative="1">
+      <w:start w:val="1"/>
+      <w:numFmt w:val="decimal"/>
+      <w:lvlText w:val="%2."/>
+      <w:lvlJc w:val="left"/>
+      <w:pPr>
+        <w:tabs>
+          <w:tab w:val="num" w:pos="1440"/>
+        </w:tabs>
+        <w:ind w:left="1440" w:hanging="360"/>
+      </w:pPr>
+    </w:lvl>
+    <w:lvl w:ilvl="2" w:tentative="1">
+      <w:start w:val="1"/>
+      <w:numFmt w:val="decimal"/>
+      <w:lvlText w:val="%3."/>
+      <w:lvlJc w:val="left"/>
+      <w:pPr>
+        <w:tabs>
+          <w:tab w:val="num" w:pos="2160"/>
+        </w:tabs>
+        <w:ind w:left="2160" w:hanging="360"/>
+      </w:pPr>
+    </w:lvl>
+    <w:lvl w:ilvl="3" w:tentative="1">
+      <w:start w:val="1"/>
+      <w:numFmt w:val="decimal"/>
+      <w:lvlText w:val="%4."/>
+      <w:lvlJc w:val="left"/>
+      <w:pPr>
+        <w:tabs>
+          <w:tab w:val="num" w:pos="2880"/>
+        </w:tabs>
+        <w:ind w:left="2880" w:hanging="360"/>
+      </w:pPr>
+    </w:lvl>
+    <w:lvl w:ilvl="4" w:tentative="1">
+      <w:start w:val="1"/>
+      <w:numFmt w:val="decimal"/>
+      <w:lvlText w:val="%5."/>
+      <w:lvlJc w:val="left"/>
+      <w:pPr>
+        <w:tabs>
+          <w:tab w:val="num" w:pos="3600"/>
+        </w:tabs>
+        <w:ind w:left="3600" w:hanging="360"/>
+      </w:pPr>
+    </w:lvl>
+    <w:lvl w:ilvl="5" w:tentative="1">
+      <w:start w:val="1"/>
+      <w:numFmt w:val="decimal"/>
+      <w:lvlText w:val="%6."/>
+      <w:lvlJc w:val="left"/>
+      <w:pPr>
+        <w:tabs>
+          <w:tab w:val="num" w:pos="4320"/>
+        </w:tabs>
+        <w:ind w:left="4320" w:hanging="360"/>
+      </w:pPr>
+    </w:lvl>
+    <w:lvl w:ilvl="6" w:tentative="1">
+      <w:start w:val="1"/>
+      <w:numFmt w:val="decimal"/>
+      <w:lvlText w:val="%7."/>
+      <w:lvlJc w:val="left"/>
+      <w:pPr>
+        <w:tabs>
+          <w:tab w:val="num" w:pos="5040"/>
+        </w:tabs>
+        <w:ind w:left="5040" w:hanging="360"/>
+      </w:pPr>
+    </w:lvl>
+    <w:lvl w:ilvl="7" w:tentative="1">
+      <w:start w:val="1"/>
+      <w:numFmt w:val="decimal"/>
+      <w:lvlText w:val="%8."/>
+      <w:lvlJc w:val="left"/>
+      <w:pPr>
+        <w:tabs>
+          <w:tab w:val="num" w:pos="5760"/>
+        </w:tabs>
+        <w:ind w:left="5760" w:hanging="360"/>
+      </w:pPr>
+    </w:lvl>
+    <w:lvl w:ilvl="8" w:tentative="1">
+      <w:start w:val="1"/>
+      <w:numFmt w:val="decimal"/>
+      <w:lvlText w:val="%9."/>
+      <w:lvlJc w:val="left"/>
+      <w:pPr>
+        <w:tabs>
+          <w:tab w:val="num" w:pos="6480"/>
+        </w:tabs>
+        <w:ind w:left="6480" w:hanging="360"/>
+      </w:pPr>
+    </w:lvl>
+  </w:abstractNum>
+  <w:abstractNum w:abstractNumId="26" w15:restartNumberingAfterBreak="0">
+    <w:nsid w:val="733B73CD"/>
+    <w:multiLevelType w:val="multilevel"/>
+    <w:tmpl w:val="9E188A6E"/>
+    <w:lvl w:ilvl="0">
+      <w:start w:val="4"/>
+      <w:numFmt w:val="decimal"/>
+      <w:lvlText w:val="%1."/>
+      <w:lvlJc w:val="left"/>
+      <w:pPr>
+        <w:tabs>
+          <w:tab w:val="num" w:pos="720"/>
+        </w:tabs>
+        <w:ind w:left="720" w:hanging="360"/>
+      </w:pPr>
+    </w:lvl>
+    <w:lvl w:ilvl="1" w:tentative="1">
+      <w:start w:val="1"/>
+      <w:numFmt w:val="decimal"/>
+      <w:lvlText w:val="%2."/>
+      <w:lvlJc w:val="left"/>
+      <w:pPr>
+        <w:tabs>
+          <w:tab w:val="num" w:pos="1440"/>
+        </w:tabs>
+        <w:ind w:left="1440" w:hanging="360"/>
+      </w:pPr>
+    </w:lvl>
+    <w:lvl w:ilvl="2" w:tentative="1">
+      <w:start w:val="1"/>
+      <w:numFmt w:val="decimal"/>
+      <w:lvlText w:val="%3."/>
+      <w:lvlJc w:val="left"/>
+      <w:pPr>
+        <w:tabs>
+          <w:tab w:val="num" w:pos="2160"/>
+        </w:tabs>
+        <w:ind w:left="2160" w:hanging="360"/>
+      </w:pPr>
+    </w:lvl>
+    <w:lvl w:ilvl="3" w:tentative="1">
+      <w:start w:val="1"/>
+      <w:numFmt w:val="decimal"/>
+      <w:lvlText w:val="%4."/>
+      <w:lvlJc w:val="left"/>
+      <w:pPr>
+        <w:tabs>
+          <w:tab w:val="num" w:pos="2880"/>
+        </w:tabs>
+        <w:ind w:left="2880" w:hanging="360"/>
+      </w:pPr>
+    </w:lvl>
+    <w:lvl w:ilvl="4" w:tentative="1">
+      <w:start w:val="1"/>
+      <w:numFmt w:val="decimal"/>
+      <w:lvlText w:val="%5."/>
+      <w:lvlJc w:val="left"/>
+      <w:pPr>
+        <w:tabs>
+          <w:tab w:val="num" w:pos="3600"/>
+        </w:tabs>
+        <w:ind w:left="3600" w:hanging="360"/>
+      </w:pPr>
+    </w:lvl>
+    <w:lvl w:ilvl="5" w:tentative="1">
+      <w:start w:val="1"/>
+      <w:numFmt w:val="decimal"/>
+      <w:lvlText w:val="%6."/>
+      <w:lvlJc w:val="left"/>
+      <w:pPr>
+        <w:tabs>
+          <w:tab w:val="num" w:pos="4320"/>
+        </w:tabs>
+        <w:ind w:left="4320" w:hanging="360"/>
+      </w:pPr>
+    </w:lvl>
+    <w:lvl w:ilvl="6" w:tentative="1">
+      <w:start w:val="1"/>
+      <w:numFmt w:val="decimal"/>
+      <w:lvlText w:val="%7."/>
+      <w:lvlJc w:val="left"/>
+      <w:pPr>
+        <w:tabs>
+          <w:tab w:val="num" w:pos="5040"/>
+        </w:tabs>
+        <w:ind w:left="5040" w:hanging="360"/>
+      </w:pPr>
+    </w:lvl>
+    <w:lvl w:ilvl="7" w:tentative="1">
+      <w:start w:val="1"/>
+      <w:numFmt w:val="decimal"/>
+      <w:lvlText w:val="%8."/>
+      <w:lvlJc w:val="left"/>
+      <w:pPr>
+        <w:tabs>
+          <w:tab w:val="num" w:pos="5760"/>
+        </w:tabs>
+        <w:ind w:left="5760" w:hanging="360"/>
+      </w:pPr>
+    </w:lvl>
+    <w:lvl w:ilvl="8" w:tentative="1">
+      <w:start w:val="1"/>
+      <w:numFmt w:val="decimal"/>
+      <w:lvlText w:val="%9."/>
+      <w:lvlJc w:val="left"/>
+      <w:pPr>
+        <w:tabs>
+          <w:tab w:val="num" w:pos="6480"/>
+        </w:tabs>
+        <w:ind w:left="6480" w:hanging="360"/>
+      </w:pPr>
+    </w:lvl>
+  </w:abstractNum>
+  <w:abstractNum w:abstractNumId="27" w15:restartNumberingAfterBreak="0">
+    <w:nsid w:val="76BD027D"/>
+    <w:multiLevelType w:val="multilevel"/>
+    <w:tmpl w:val="6060DCF6"/>
+    <w:lvl w:ilvl="0">
+      <w:start w:val="1"/>
+      <w:numFmt w:val="decimal"/>
+      <w:lvlText w:val="%1."/>
+      <w:lvlJc w:val="left"/>
+      <w:pPr>
+        <w:tabs>
+          <w:tab w:val="num" w:pos="720"/>
+        </w:tabs>
+        <w:ind w:left="720" w:hanging="360"/>
+      </w:pPr>
+    </w:lvl>
+    <w:lvl w:ilvl="1" w:tentative="1">
+      <w:start w:val="1"/>
+      <w:numFmt w:val="decimal"/>
+      <w:lvlText w:val="%2."/>
+      <w:lvlJc w:val="left"/>
+      <w:pPr>
+        <w:tabs>
+          <w:tab w:val="num" w:pos="1440"/>
+        </w:tabs>
+        <w:ind w:left="1440" w:hanging="360"/>
+      </w:pPr>
+    </w:lvl>
+    <w:lvl w:ilvl="2" w:tentative="1">
+      <w:start w:val="1"/>
+      <w:numFmt w:val="decimal"/>
+      <w:lvlText w:val="%3."/>
+      <w:lvlJc w:val="left"/>
+      <w:pPr>
+        <w:tabs>
+          <w:tab w:val="num" w:pos="2160"/>
+        </w:tabs>
+        <w:ind w:left="2160" w:hanging="360"/>
+      </w:pPr>
+    </w:lvl>
+    <w:lvl w:ilvl="3" w:tentative="1">
+      <w:start w:val="1"/>
+      <w:numFmt w:val="decimal"/>
+      <w:lvlText w:val="%4."/>
+      <w:lvlJc w:val="left"/>
+      <w:pPr>
+        <w:tabs>
+          <w:tab w:val="num" w:pos="2880"/>
+        </w:tabs>
+        <w:ind w:left="2880" w:hanging="360"/>
+      </w:pPr>
+    </w:lvl>
+    <w:lvl w:ilvl="4" w:tentative="1">
+      <w:start w:val="1"/>
+      <w:numFmt w:val="decimal"/>
+      <w:lvlText w:val="%5."/>
+      <w:lvlJc w:val="left"/>
+      <w:pPr>
+        <w:tabs>
+          <w:tab w:val="num" w:pos="3600"/>
+        </w:tabs>
+        <w:ind w:left="3600" w:hanging="360"/>
+      </w:pPr>
+    </w:lvl>
+    <w:lvl w:ilvl="5" w:tentative="1">
+      <w:start w:val="1"/>
+      <w:numFmt w:val="decimal"/>
+      <w:lvlText w:val="%6."/>
+      <w:lvlJc w:val="left"/>
+      <w:pPr>
+        <w:tabs>
+          <w:tab w:val="num" w:pos="4320"/>
+        </w:tabs>
+        <w:ind w:left="4320" w:hanging="360"/>
+      </w:pPr>
+    </w:lvl>
+    <w:lvl w:ilvl="6" w:tentative="1">
+      <w:start w:val="1"/>
+      <w:numFmt w:val="decimal"/>
+      <w:lvlText w:val="%7."/>
+      <w:lvlJc w:val="left"/>
+      <w:pPr>
+        <w:tabs>
+          <w:tab w:val="num" w:pos="5040"/>
+        </w:tabs>
+        <w:ind w:left="5040" w:hanging="360"/>
+      </w:pPr>
+    </w:lvl>
+    <w:lvl w:ilvl="7" w:tentative="1">
+      <w:start w:val="1"/>
+      <w:numFmt w:val="decimal"/>
+      <w:lvlText w:val="%8."/>
+      <w:lvlJc w:val="left"/>
+      <w:pPr>
+        <w:tabs>
+          <w:tab w:val="num" w:pos="5760"/>
+        </w:tabs>
+        <w:ind w:left="5760" w:hanging="360"/>
+      </w:pPr>
+    </w:lvl>
+    <w:lvl w:ilvl="8" w:tentative="1">
+      <w:start w:val="1"/>
+      <w:numFmt w:val="decimal"/>
+      <w:lvlText w:val="%9."/>
+      <w:lvlJc w:val="left"/>
+      <w:pPr>
+        <w:tabs>
+          <w:tab w:val="num" w:pos="6480"/>
+        </w:tabs>
+        <w:ind w:left="6480" w:hanging="360"/>
+      </w:pPr>
+    </w:lvl>
+  </w:abstractNum>
+  <w:abstractNum w:abstractNumId="28" w15:restartNumberingAfterBreak="0">
+    <w:nsid w:val="780E0947"/>
+    <w:multiLevelType w:val="multilevel"/>
+    <w:tmpl w:val="565435FE"/>
+    <w:lvl w:ilvl="0">
+      <w:start w:val="1"/>
+      <w:numFmt w:val="bullet"/>
+      <w:lvlText w:val=""/>
+      <w:lvlJc w:val="left"/>
+      <w:pPr>
+        <w:tabs>
+          <w:tab w:val="num" w:pos="720"/>
+        </w:tabs>
+        <w:ind w:left="720" w:hanging="360"/>
+      </w:pPr>
+      <w:rPr>
+        <w:rFonts w:ascii="Symbol" w:hAnsi="Symbol" w:hint="default"/>
+        <w:sz w:val="20"/>
+      </w:rPr>
+    </w:lvl>
+    <w:lvl w:ilvl="1" w:tentative="1">
+      <w:start w:val="1"/>
+      <w:numFmt w:val="bullet"/>
+      <w:lvlText w:val="o"/>
+      <w:lvlJc w:val="left"/>
+      <w:pPr>
+        <w:tabs>
+          <w:tab w:val="num" w:pos="1440"/>
+        </w:tabs>
+        <w:ind w:left="1440" w:hanging="360"/>
+      </w:pPr>
+      <w:rPr>
+        <w:rFonts w:ascii="Courier New" w:hAnsi="Courier New" w:hint="default"/>
+        <w:sz w:val="20"/>
+      </w:rPr>
+    </w:lvl>
+    <w:lvl w:ilvl="2" w:tentative="1">
+      <w:start w:val="1"/>
+      <w:numFmt w:val="bullet"/>
+      <w:lvlText w:val=""/>
+      <w:lvlJc w:val="left"/>
+      <w:pPr>
+        <w:tabs>
+          <w:tab w:val="num" w:pos="2160"/>
+        </w:tabs>
+        <w:ind w:left="2160" w:hanging="360"/>
+      </w:pPr>
+      <w:rPr>
+        <w:rFonts w:ascii="Wingdings" w:hAnsi="Wingdings" w:hint="default"/>
+        <w:sz w:val="20"/>
+      </w:rPr>
+    </w:lvl>
+    <w:lvl w:ilvl="3" w:tentative="1">
+      <w:start w:val="1"/>
+      <w:numFmt w:val="bullet"/>
+      <w:lvlText w:val=""/>
+      <w:lvlJc w:val="left"/>
+      <w:pPr>
+        <w:tabs>
+          <w:tab w:val="num" w:pos="2880"/>
+        </w:tabs>
+        <w:ind w:left="2880" w:hanging="360"/>
+      </w:pPr>
+      <w:rPr>
+        <w:rFonts w:ascii="Wingdings" w:hAnsi="Wingdings" w:hint="default"/>
+        <w:sz w:val="20"/>
+      </w:rPr>
+    </w:lvl>
+    <w:lvl w:ilvl="4" w:tentative="1">
+      <w:start w:val="1"/>
+      <w:numFmt w:val="bullet"/>
+      <w:lvlText w:val=""/>
+      <w:lvlJc w:val="left"/>
+      <w:pPr>
+        <w:tabs>
+          <w:tab w:val="num" w:pos="3600"/>
+        </w:tabs>
+        <w:ind w:left="3600" w:hanging="360"/>
+      </w:pPr>
+      <w:rPr>
+        <w:rFonts w:ascii="Wingdings" w:hAnsi="Wingdings" w:hint="default"/>
+        <w:sz w:val="20"/>
+      </w:rPr>
+    </w:lvl>
+    <w:lvl w:ilvl="5" w:tentative="1">
+      <w:start w:val="1"/>
+      <w:numFmt w:val="bullet"/>
+      <w:lvlText w:val=""/>
+      <w:lvlJc w:val="left"/>
+      <w:pPr>
+        <w:tabs>
+          <w:tab w:val="num" w:pos="4320"/>
+        </w:tabs>
+        <w:ind w:left="4320" w:hanging="360"/>
+      </w:pPr>
+      <w:rPr>
+        <w:rFonts w:ascii="Wingdings" w:hAnsi="Wingdings" w:hint="default"/>
+        <w:sz w:val="20"/>
+      </w:rPr>
+    </w:lvl>
+    <w:lvl w:ilvl="6" w:tentative="1">
+      <w:start w:val="1"/>
+      <w:numFmt w:val="bullet"/>
+      <w:lvlText w:val=""/>
+      <w:lvlJc w:val="left"/>
+      <w:pPr>
+        <w:tabs>
+          <w:tab w:val="num" w:pos="5040"/>
+        </w:tabs>
+        <w:ind w:left="5040" w:hanging="360"/>
+      </w:pPr>
+      <w:rPr>
+        <w:rFonts w:ascii="Wingdings" w:hAnsi="Wingdings" w:hint="default"/>
+        <w:sz w:val="20"/>
+      </w:rPr>
+    </w:lvl>
+    <w:lvl w:ilvl="7" w:tentative="1">
+      <w:start w:val="1"/>
+      <w:numFmt w:val="bullet"/>
+      <w:lvlText w:val=""/>
+      <w:lvlJc w:val="left"/>
+      <w:pPr>
+        <w:tabs>
+          <w:tab w:val="num" w:pos="5760"/>
+        </w:tabs>
+        <w:ind w:left="5760" w:hanging="360"/>
+      </w:pPr>
+      <w:rPr>
+        <w:rFonts w:ascii="Wingdings" w:hAnsi="Wingdings" w:hint="default"/>
+        <w:sz w:val="20"/>
+      </w:rPr>
+    </w:lvl>
+    <w:lvl w:ilvl="8" w:tentative="1">
+      <w:start w:val="1"/>
+      <w:numFmt w:val="bullet"/>
+      <w:lvlText w:val=""/>
+      <w:lvlJc w:val="left"/>
+      <w:pPr>
+        <w:tabs>
+          <w:tab w:val="num" w:pos="6480"/>
+        </w:tabs>
+        <w:ind w:left="6480" w:hanging="360"/>
+      </w:pPr>
+      <w:rPr>
+        <w:rFonts w:ascii="Wingdings" w:hAnsi="Wingdings" w:hint="default"/>
+        <w:sz w:val="20"/>
+      </w:rPr>
+    </w:lvl>
+  </w:abstractNum>
+  <w:abstractNum w:abstractNumId="29" w15:restartNumberingAfterBreak="0">
     <w:nsid w:val="79225BF1"/>
     <w:multiLevelType w:val="multilevel"/>
     <w:tmpl w:val="F604A0CC"/>
@@ -12083,7 +14398,7 @@
       </w:pPr>
     </w:lvl>
   </w:abstractNum>
-  <w:abstractNum w:abstractNumId="20" w15:restartNumberingAfterBreak="0">
+  <w:abstractNum w:abstractNumId="30" w15:restartNumberingAfterBreak="0">
     <w:nsid w:val="7A810B3E"/>
     <w:multiLevelType w:val="multilevel"/>
     <w:tmpl w:val="E16453D8"/>
@@ -12233,7 +14548,7 @@
     </w:lvl>
   </w:abstractNum>
   <w:num w:numId="1" w16cid:durableId="282812885">
-    <w:abstractNumId w:val="16"/>
+    <w:abstractNumId w:val="21"/>
   </w:num>
   <w:num w:numId="2" w16cid:durableId="1260914112">
     <w:abstractNumId w:val="0"/>
@@ -12632,55 +14947,85 @@
     </w:lvlOverride>
   </w:num>
   <w:num w:numId="17" w16cid:durableId="372971411">
-    <w:abstractNumId w:val="18"/>
+    <w:abstractNumId w:val="24"/>
   </w:num>
   <w:num w:numId="18" w16cid:durableId="932475396">
-    <w:abstractNumId w:val="7"/>
+    <w:abstractNumId w:val="9"/>
   </w:num>
   <w:num w:numId="19" w16cid:durableId="263734759">
-    <w:abstractNumId w:val="14"/>
+    <w:abstractNumId w:val="19"/>
   </w:num>
   <w:num w:numId="20" w16cid:durableId="324479240">
-    <w:abstractNumId w:val="17"/>
+    <w:abstractNumId w:val="23"/>
   </w:num>
   <w:num w:numId="21" w16cid:durableId="1503163015">
-    <w:abstractNumId w:val="9"/>
+    <w:abstractNumId w:val="11"/>
   </w:num>
   <w:num w:numId="22" w16cid:durableId="105081811">
-    <w:abstractNumId w:val="19"/>
+    <w:abstractNumId w:val="29"/>
   </w:num>
   <w:num w:numId="23" w16cid:durableId="1871843861">
-    <w:abstractNumId w:val="6"/>
+    <w:abstractNumId w:val="8"/>
   </w:num>
   <w:num w:numId="24" w16cid:durableId="462427889">
+    <w:abstractNumId w:val="20"/>
+  </w:num>
+  <w:num w:numId="25" w16cid:durableId="687021865">
+    <w:abstractNumId w:val="12"/>
+  </w:num>
+  <w:num w:numId="26" w16cid:durableId="887645378">
     <w:abstractNumId w:val="15"/>
   </w:num>
-  <w:num w:numId="25" w16cid:durableId="687021865">
+  <w:num w:numId="27" w16cid:durableId="852452339">
     <w:abstractNumId w:val="10"/>
   </w:num>
-  <w:num w:numId="26" w16cid:durableId="887645378">
-    <w:abstractNumId w:val="12"/>
-  </w:num>
-  <w:num w:numId="27" w16cid:durableId="852452339">
-    <w:abstractNumId w:val="8"/>
-  </w:num>
   <w:num w:numId="28" w16cid:durableId="1897886042">
-    <w:abstractNumId w:val="13"/>
+    <w:abstractNumId w:val="18"/>
   </w:num>
   <w:num w:numId="29" w16cid:durableId="1610699378">
     <w:abstractNumId w:val="3"/>
   </w:num>
   <w:num w:numId="30" w16cid:durableId="1201824128">
-    <w:abstractNumId w:val="4"/>
+    <w:abstractNumId w:val="5"/>
   </w:num>
   <w:num w:numId="31" w16cid:durableId="434056291">
-    <w:abstractNumId w:val="5"/>
+    <w:abstractNumId w:val="7"/>
   </w:num>
   <w:num w:numId="32" w16cid:durableId="760177085">
-    <w:abstractNumId w:val="11"/>
+    <w:abstractNumId w:val="14"/>
   </w:num>
   <w:num w:numId="33" w16cid:durableId="127747478">
-    <w:abstractNumId w:val="20"/>
+    <w:abstractNumId w:val="30"/>
+  </w:num>
+  <w:num w:numId="34" w16cid:durableId="1976132541">
+    <w:abstractNumId w:val="16"/>
+  </w:num>
+  <w:num w:numId="35" w16cid:durableId="1494180898">
+    <w:abstractNumId w:val="6"/>
+  </w:num>
+  <w:num w:numId="36" w16cid:durableId="1308172269">
+    <w:abstractNumId w:val="28"/>
+  </w:num>
+  <w:num w:numId="37" w16cid:durableId="1593664102">
+    <w:abstractNumId w:val="13"/>
+  </w:num>
+  <w:num w:numId="38" w16cid:durableId="84688825">
+    <w:abstractNumId w:val="26"/>
+  </w:num>
+  <w:num w:numId="39" w16cid:durableId="690373173">
+    <w:abstractNumId w:val="27"/>
+  </w:num>
+  <w:num w:numId="40" w16cid:durableId="1594627391">
+    <w:abstractNumId w:val="17"/>
+  </w:num>
+  <w:num w:numId="41" w16cid:durableId="2008359989">
+    <w:abstractNumId w:val="25"/>
+  </w:num>
+  <w:num w:numId="42" w16cid:durableId="11423798">
+    <w:abstractNumId w:val="22"/>
+  </w:num>
+  <w:num w:numId="43" w16cid:durableId="1960182468">
+    <w:abstractNumId w:val="4"/>
   </w:num>
 </w:numbering>
 </file>
@@ -13081,7 +15426,7 @@
   <w:style w:type="paragraph" w:default="1" w:styleId="Normal">
     <w:name w:val="Normal"/>
     <w:qFormat/>
-    <w:rsid w:val="00680D3F"/>
+    <w:rsid w:val="002D2EAB"/>
   </w:style>
   <w:style w:type="paragraph" w:styleId="Ttulo1">
     <w:name w:val="heading 1"/>

</xml_diff>